<commit_message>
docs: regenerar Modo de uso.docx con vault compartido y portabilidad
Co-Authored-By: Claude Fable 5 <noreply@anthropic.com>
Claude-Session: https://claude.ai/code/session_01TjtbNQnWLrTdiZ1EqBtfuR
</commit_message>
<xml_diff>
--- a/Modo de Uso/Modo de uso.docx
+++ b/Modo de Uso/Modo de uso.docx
@@ -167,7 +167,7 @@
     <w:p>
       <w:pPr>
         <w:pStyle w:val="NormalWeb"/>
-        <w:divId w:val="222840433"/>
+        <w:divId w:val="213548435"/>
         <w:rPr>
           <w:rFonts w:ascii="Calibri" w:hAnsi="Calibri" w:cs="Calibri"/>
           <w:color w:val="555555"/>
@@ -558,7 +558,7 @@
           <w:sz w:val="22"/>
           <w:szCs w:val="22"/>
         </w:rPr>
-        <w:pict w14:anchorId="503C7166">
+        <w:pict w14:anchorId="77C54695">
           <v:rect id="_x0000_i1025" style="width:0;height:1.5pt" o:hralign="center" o:hrstd="t" o:hr="t" fillcolor="#a0a0a0" stroked="f"/>
         </w:pict>
       </w:r>
@@ -769,7 +769,7 @@
           <w:sz w:val="22"/>
           <w:szCs w:val="22"/>
         </w:rPr>
-        <w:pict w14:anchorId="39D7464C">
+        <w:pict w14:anchorId="6631B55E">
           <v:rect id="_x0000_i1026" style="width:0;height:1.5pt" o:hralign="center" o:hrstd="t" o:hr="t" fillcolor="#a0a0a0" stroked="f"/>
         </w:pict>
       </w:r>
@@ -1679,7 +1679,7 @@
           <w:sz w:val="22"/>
           <w:szCs w:val="22"/>
         </w:rPr>
-        <w:pict w14:anchorId="12B0AF33">
+        <w:pict w14:anchorId="1C07BF14">
           <v:rect id="_x0000_i1027" style="width:0;height:1.5pt" o:hralign="center" o:hrstd="t" o:hr="t" fillcolor="#a0a0a0" stroked="f"/>
         </w:pict>
       </w:r>
@@ -1922,7 +1922,7 @@
           <w:sz w:val="22"/>
           <w:szCs w:val="22"/>
         </w:rPr>
-        <w:pict w14:anchorId="1F3DE5FC">
+        <w:pict w14:anchorId="703A1344">
           <v:rect id="_x0000_i1028" style="width:0;height:1.5pt" o:hralign="center" o:hrstd="t" o:hr="t" fillcolor="#a0a0a0" stroked="f"/>
         </w:pict>
       </w:r>
@@ -2369,7 +2369,7 @@
           <w:sz w:val="22"/>
           <w:szCs w:val="22"/>
         </w:rPr>
-        <w:pict w14:anchorId="24ACBFB4">
+        <w:pict w14:anchorId="7F020FF6">
           <v:rect id="_x0000_i1029" style="width:0;height:1.5pt" o:hralign="center" o:hrstd="t" o:hr="t" fillcolor="#a0a0a0" stroked="f"/>
         </w:pict>
       </w:r>
@@ -3714,6 +3714,124 @@
         <w:rPr>
           <w:rFonts w:ascii="Calibri" w:eastAsia="Times New Roman" w:hAnsi="Calibri" w:cs="Calibri"/>
         </w:rPr>
+        <w:t>Vault compartido via GitHub</w:t>
+      </w:r>
+    </w:p>
+    <w:p>
+      <w:pPr>
+        <w:pStyle w:val="NormalWeb"/>
+        <w:rPr>
+          <w:rFonts w:ascii="Calibri" w:hAnsi="Calibri" w:cs="Calibri"/>
+          <w:sz w:val="22"/>
+          <w:szCs w:val="22"/>
+        </w:rPr>
+      </w:pPr>
+      <w:r>
+        <w:rPr>
+          <w:rFonts w:ascii="Calibri" w:hAnsi="Calibri" w:cs="Calibri"/>
+          <w:sz w:val="22"/>
+          <w:szCs w:val="22"/>
+        </w:rPr>
+        <w:t>El vault es un repo git privado (</w:t>
+      </w:r>
+      <w:r>
+        <w:rPr>
+          <w:rStyle w:val="CdigoHTML"/>
+        </w:rPr>
+        <w:t>sdd-vault</w:t>
+      </w:r>
+      <w:r>
+        <w:rPr>
+          <w:rFonts w:ascii="Calibri" w:hAnsi="Calibri" w:cs="Calibri"/>
+          <w:sz w:val="22"/>
+          <w:szCs w:val="22"/>
+        </w:rPr>
+        <w:t>) — la memoria del workflow viaja entre máquinas y programadores:</w:t>
+      </w:r>
+    </w:p>
+    <w:p>
+      <w:pPr>
+        <w:numPr>
+          <w:ilvl w:val="0"/>
+          <w:numId w:val="6"/>
+        </w:numPr>
+        <w:spacing w:before="100" w:beforeAutospacing="1" w:after="100" w:afterAutospacing="1"/>
+        <w:rPr>
+          <w:rFonts w:ascii="Calibri" w:eastAsia="Times New Roman" w:hAnsi="Calibri" w:cs="Calibri"/>
+          <w:sz w:val="22"/>
+          <w:szCs w:val="22"/>
+        </w:rPr>
+      </w:pPr>
+      <w:r>
+        <w:rPr>
+          <w:rFonts w:ascii="Calibri" w:eastAsia="Times New Roman" w:hAnsi="Calibri" w:cs="Calibri"/>
+          <w:sz w:val="22"/>
+          <w:szCs w:val="22"/>
+        </w:rPr>
+        <w:t xml:space="preserve">Claude hace </w:t>
+      </w:r>
+      <w:r>
+        <w:rPr>
+          <w:rStyle w:val="CdigoHTML"/>
+        </w:rPr>
+        <w:t>git pull --rebase</w:t>
+      </w:r>
+      <w:r>
+        <w:rPr>
+          <w:rFonts w:ascii="Calibri" w:eastAsia="Times New Roman" w:hAnsi="Calibri" w:cs="Calibri"/>
+          <w:sz w:val="22"/>
+          <w:szCs w:val="22"/>
+        </w:rPr>
+        <w:t xml:space="preserve"> al iniciar sesión y commit+push tras cada operación que escribe en el vault.</w:t>
+      </w:r>
+    </w:p>
+    <w:p>
+      <w:pPr>
+        <w:numPr>
+          <w:ilvl w:val="0"/>
+          <w:numId w:val="6"/>
+        </w:numPr>
+        <w:spacing w:before="100" w:beforeAutospacing="1" w:after="100" w:afterAutospacing="1"/>
+        <w:rPr>
+          <w:rFonts w:ascii="Calibri" w:eastAsia="Times New Roman" w:hAnsi="Calibri" w:cs="Calibri"/>
+          <w:sz w:val="22"/>
+          <w:szCs w:val="22"/>
+        </w:rPr>
+      </w:pPr>
+      <w:r>
+        <w:rPr>
+          <w:rFonts w:ascii="Calibri" w:eastAsia="Times New Roman" w:hAnsi="Calibri" w:cs="Calibri"/>
+          <w:sz w:val="22"/>
+          <w:szCs w:val="22"/>
+        </w:rPr>
+        <w:t xml:space="preserve">Si dos personas trabajan el mismo proyecto en paralelo, coordinar: </w:t>
+      </w:r>
+      <w:r>
+        <w:rPr>
+          <w:rStyle w:val="CdigoHTML"/>
+        </w:rPr>
+        <w:t>context.md</w:t>
+      </w:r>
+      <w:r>
+        <w:rPr>
+          <w:rFonts w:ascii="Calibri" w:eastAsia="Times New Roman" w:hAnsi="Calibri" w:cs="Calibri"/>
+          <w:sz w:val="22"/>
+          <w:szCs w:val="22"/>
+        </w:rPr>
+        <w:t xml:space="preserve"> se reescribe en cada operación.</w:t>
+      </w:r>
+    </w:p>
+    <w:p>
+      <w:pPr>
+        <w:pStyle w:val="Ttulo3"/>
+        <w:rPr>
+          <w:rFonts w:ascii="Calibri" w:eastAsia="Times New Roman" w:hAnsi="Calibri" w:cs="Calibri"/>
+        </w:rPr>
+      </w:pPr>
+      <w:r>
+        <w:rPr>
+          <w:rFonts w:ascii="Calibri" w:eastAsia="Times New Roman" w:hAnsi="Calibri" w:cs="Calibri"/>
+        </w:rPr>
         <w:t>Portabilidad entre máquinas</w:t>
       </w:r>
     </w:p>
@@ -3732,21 +3850,7 @@
           <w:sz w:val="22"/>
           <w:szCs w:val="22"/>
         </w:rPr>
-        <w:t xml:space="preserve">La ruta del vault vive en </w:t>
-      </w:r>
-      <w:r>
-        <w:rPr>
-          <w:rStyle w:val="CdigoHTML"/>
-        </w:rPr>
-        <w:t>$env:OBSIDIAN_VAULT</w:t>
-      </w:r>
-      <w:r>
-        <w:rPr>
-          <w:rFonts w:ascii="Calibri" w:hAnsi="Calibri" w:cs="Calibri"/>
-          <w:sz w:val="22"/>
-          <w:szCs w:val="22"/>
-        </w:rPr>
-        <w:t>. En cada máquina nueva:</w:t>
+        <w:t>En cada máquina nueva:</w:t>
       </w:r>
     </w:p>
     <w:p>
@@ -3760,6 +3864,28 @@
         <w:rPr>
           <w:rStyle w:val="CdigoHTML"/>
         </w:rPr>
+        <w:t>git clone https://github.com/lmontecchiani-dev/sdd-vault "C:\TPA"   # o la ruta que prefieras</w:t>
+      </w:r>
+    </w:p>
+    <w:p>
+      <w:pPr>
+        <w:pStyle w:val="HTMLconformatoprevio"/>
+        <w:rPr>
+          <w:rStyle w:val="CdigoHTML"/>
+        </w:rPr>
+      </w:pPr>
+    </w:p>
+    <w:p>
+      <w:pPr>
+        <w:pStyle w:val="HTMLconformatoprevio"/>
+        <w:rPr>
+          <w:rStyle w:val="CdigoHTML"/>
+        </w:rPr>
+      </w:pPr>
+      <w:r>
+        <w:rPr>
+          <w:rStyle w:val="CdigoHTML"/>
+        </w:rPr>
         <w:t># Agregar a $PROFILE</w:t>
       </w:r>
     </w:p>
@@ -3774,7 +3900,13 @@
         <w:rPr>
           <w:rStyle w:val="CdigoHTML"/>
         </w:rPr>
-        <w:t>$env:OBSIDIAN_VAULT = "D:\MiVault"   # ruta real en esa máquina</w:t>
+        <w:t xml:space="preserve">$env:OBSIDIAN_VAULT = "C:\TPA"   </w:t>
+      </w:r>
+      <w:r>
+        <w:rPr>
+          <w:rStyle w:val="CdigoHTML"/>
+        </w:rPr>
+        <w:t># la misma ruta del clone</w:t>
       </w:r>
     </w:p>
     <w:p>
@@ -3808,9 +3940,9 @@
 <file path=word/numbering.xml><?xml version="1.0" encoding="utf-8"?>
 <w:numbering xmlns:wpc="http://schemas.microsoft.com/office/word/2010/wordprocessingCanvas" xmlns:cx="http://schemas.microsoft.com/office/drawing/2014/chartex" xmlns:cx1="http://schemas.microsoft.com/office/drawing/2015/9/8/chartex" xmlns:cx2="http://schemas.microsoft.com/office/drawing/2015/10/21/chartex" xmlns:cx3="http://schemas.microsoft.com/office/drawing/2016/5/9/chartex" xmlns:cx4="http://schemas.microsoft.com/office/drawing/2016/5/10/chartex" xmlns:cx5="http://schemas.microsoft.com/office/drawing/2016/5/11/chartex" xmlns:cx6="http://schemas.microsoft.com/office/drawing/2016/5/12/chartex" xmlns:cx7="http://schemas.microsoft.com/office/drawing/2016/5/13/chartex" xmlns:cx8="http://schemas.microsoft.com/office/drawing/2016/5/14/chartex" xmlns:mc="http://schemas.openxmlformats.org/markup-compatibility/2006" xmlns:aink="http://schemas.microsoft.com/office/drawing/2016/ink" xmlns:am3d="http://schemas.microsoft.com/office/drawing/2017/model3d" xmlns:o="urn:schemas-microsoft-com:office:office" xmlns:oel="http://schemas.microsoft.com/office/2019/extlst" xmlns:r="http://schemas.openxmlformats.org/officeDocument/2006/relationships" xmlns:m="http://schemas.openxmlformats.org/officeDocument/2006/math" xmlns:v="urn:schemas-microsoft-com:vml" xmlns:wp14="http://schemas.microsoft.com/office/word/2010/wordprocessingDrawing" xmlns:wp="http://schemas.openxmlformats.org/drawingml/2006/wordprocessingDrawing" xmlns:w10="urn:schemas-microsoft-com:office:word" xmlns:w="http://schemas.openxmlformats.org/wordprocessingml/2006/main" xmlns:w14="http://schemas.microsoft.com/office/word/2010/wordml" xmlns:w15="http://schemas.microsoft.com/office/word/2012/wordml" xmlns:w16cex="http://schemas.microsoft.com/office/word/2018/wordml/cex" xmlns:w16cid="http://schemas.microsoft.com/office/word/2016/wordml/cid" xmlns:w16="http://schemas.microsoft.com/office/word/2018/wordml" xmlns:w16du="http://schemas.microsoft.com/office/word/2023/wordml/word16du" xmlns:w16sdtdh="http://schemas.microsoft.com/office/word/2020/wordml/sdtdatahash" xmlns:w16sdtfl="http://schemas.microsoft.com/office/word/2024/wordml/sdtformatlock" xmlns:w16se="http://schemas.microsoft.com/office/word/2015/wordml/symex" xmlns:wpg="http://schemas.microsoft.com/office/word/2010/wordprocessingGroup" xmlns:wpi="http://schemas.microsoft.com/office/word/2010/wordprocessingInk" xmlns:wne="http://schemas.microsoft.com/office/word/2006/wordml" xmlns:wps="http://schemas.microsoft.com/office/word/2010/wordprocessingShape" mc:Ignorable="w14 w15 w16se w16cid w16 w16cex w16sdtdh w16sdtfl w16du wp14">
   <w:abstractNum w:abstractNumId="0" w15:restartNumberingAfterBreak="0">
-    <w:nsid w:val="01931EFD"/>
+    <w:nsid w:val="241036A1"/>
     <w:multiLevelType w:val="multilevel"/>
-    <w:tmpl w:val="1FDE000C"/>
+    <w:tmpl w:val="4FF4CF4E"/>
     <w:lvl w:ilvl="0">
       <w:start w:val="1"/>
       <w:numFmt w:val="bullet"/>
@@ -3957,9 +4089,9 @@
     </w:lvl>
   </w:abstractNum>
   <w:abstractNum w:abstractNumId="1" w15:restartNumberingAfterBreak="0">
-    <w:nsid w:val="41B45433"/>
+    <w:nsid w:val="2E647D6D"/>
     <w:multiLevelType w:val="multilevel"/>
-    <w:tmpl w:val="CF06C93C"/>
+    <w:tmpl w:val="02A4BA30"/>
     <w:lvl w:ilvl="0">
       <w:start w:val="1"/>
       <w:numFmt w:val="bullet"/>
@@ -4106,9 +4238,9 @@
     </w:lvl>
   </w:abstractNum>
   <w:abstractNum w:abstractNumId="2" w15:restartNumberingAfterBreak="0">
-    <w:nsid w:val="63805F51"/>
+    <w:nsid w:val="54C01DCE"/>
     <w:multiLevelType w:val="multilevel"/>
-    <w:tmpl w:val="075CD306"/>
+    <w:tmpl w:val="6024B9E8"/>
     <w:lvl w:ilvl="0">
       <w:start w:val="1"/>
       <w:numFmt w:val="bullet"/>
@@ -4255,9 +4387,9 @@
     </w:lvl>
   </w:abstractNum>
   <w:abstractNum w:abstractNumId="3" w15:restartNumberingAfterBreak="0">
-    <w:nsid w:val="6F23722A"/>
+    <w:nsid w:val="54EE678B"/>
     <w:multiLevelType w:val="multilevel"/>
-    <w:tmpl w:val="1854B582"/>
+    <w:tmpl w:val="03341A32"/>
     <w:lvl w:ilvl="0">
       <w:start w:val="1"/>
       <w:numFmt w:val="bullet"/>
@@ -4404,9 +4536,9 @@
     </w:lvl>
   </w:abstractNum>
   <w:abstractNum w:abstractNumId="4" w15:restartNumberingAfterBreak="0">
-    <w:nsid w:val="7514418F"/>
+    <w:nsid w:val="58C42F2A"/>
     <w:multiLevelType w:val="multilevel"/>
-    <w:tmpl w:val="8BC204D8"/>
+    <w:tmpl w:val="2E3E8936"/>
     <w:lvl w:ilvl="0">
       <w:start w:val="1"/>
       <w:numFmt w:val="bullet"/>
@@ -4552,20 +4684,172 @@
       </w:rPr>
     </w:lvl>
   </w:abstractNum>
-  <w:num w:numId="1" w16cid:durableId="416366388">
-    <w:abstractNumId w:val="4"/>
-  </w:num>
-  <w:num w:numId="2" w16cid:durableId="420104672">
+  <w:abstractNum w:abstractNumId="5" w15:restartNumberingAfterBreak="0">
+    <w:nsid w:val="7E392D9C"/>
+    <w:multiLevelType w:val="multilevel"/>
+    <w:tmpl w:val="CAC81010"/>
+    <w:lvl w:ilvl="0">
+      <w:start w:val="1"/>
+      <w:numFmt w:val="bullet"/>
+      <w:lvlText w:val=""/>
+      <w:lvlJc w:val="left"/>
+      <w:pPr>
+        <w:tabs>
+          <w:tab w:val="num" w:pos="720"/>
+        </w:tabs>
+        <w:ind w:left="720" w:hanging="360"/>
+      </w:pPr>
+      <w:rPr>
+        <w:rFonts w:ascii="Symbol" w:hAnsi="Symbol" w:hint="default"/>
+        <w:sz w:val="20"/>
+      </w:rPr>
+    </w:lvl>
+    <w:lvl w:ilvl="1" w:tentative="1">
+      <w:start w:val="1"/>
+      <w:numFmt w:val="bullet"/>
+      <w:lvlText w:val="o"/>
+      <w:lvlJc w:val="left"/>
+      <w:pPr>
+        <w:tabs>
+          <w:tab w:val="num" w:pos="1440"/>
+        </w:tabs>
+        <w:ind w:left="1440" w:hanging="360"/>
+      </w:pPr>
+      <w:rPr>
+        <w:rFonts w:ascii="Courier New" w:hAnsi="Courier New" w:hint="default"/>
+        <w:sz w:val="20"/>
+      </w:rPr>
+    </w:lvl>
+    <w:lvl w:ilvl="2" w:tentative="1">
+      <w:start w:val="1"/>
+      <w:numFmt w:val="bullet"/>
+      <w:lvlText w:val=""/>
+      <w:lvlJc w:val="left"/>
+      <w:pPr>
+        <w:tabs>
+          <w:tab w:val="num" w:pos="2160"/>
+        </w:tabs>
+        <w:ind w:left="2160" w:hanging="360"/>
+      </w:pPr>
+      <w:rPr>
+        <w:rFonts w:ascii="Wingdings" w:hAnsi="Wingdings" w:hint="default"/>
+        <w:sz w:val="20"/>
+      </w:rPr>
+    </w:lvl>
+    <w:lvl w:ilvl="3" w:tentative="1">
+      <w:start w:val="1"/>
+      <w:numFmt w:val="bullet"/>
+      <w:lvlText w:val=""/>
+      <w:lvlJc w:val="left"/>
+      <w:pPr>
+        <w:tabs>
+          <w:tab w:val="num" w:pos="2880"/>
+        </w:tabs>
+        <w:ind w:left="2880" w:hanging="360"/>
+      </w:pPr>
+      <w:rPr>
+        <w:rFonts w:ascii="Wingdings" w:hAnsi="Wingdings" w:hint="default"/>
+        <w:sz w:val="20"/>
+      </w:rPr>
+    </w:lvl>
+    <w:lvl w:ilvl="4" w:tentative="1">
+      <w:start w:val="1"/>
+      <w:numFmt w:val="bullet"/>
+      <w:lvlText w:val=""/>
+      <w:lvlJc w:val="left"/>
+      <w:pPr>
+        <w:tabs>
+          <w:tab w:val="num" w:pos="3600"/>
+        </w:tabs>
+        <w:ind w:left="3600" w:hanging="360"/>
+      </w:pPr>
+      <w:rPr>
+        <w:rFonts w:ascii="Wingdings" w:hAnsi="Wingdings" w:hint="default"/>
+        <w:sz w:val="20"/>
+      </w:rPr>
+    </w:lvl>
+    <w:lvl w:ilvl="5" w:tentative="1">
+      <w:start w:val="1"/>
+      <w:numFmt w:val="bullet"/>
+      <w:lvlText w:val=""/>
+      <w:lvlJc w:val="left"/>
+      <w:pPr>
+        <w:tabs>
+          <w:tab w:val="num" w:pos="4320"/>
+        </w:tabs>
+        <w:ind w:left="4320" w:hanging="360"/>
+      </w:pPr>
+      <w:rPr>
+        <w:rFonts w:ascii="Wingdings" w:hAnsi="Wingdings" w:hint="default"/>
+        <w:sz w:val="20"/>
+      </w:rPr>
+    </w:lvl>
+    <w:lvl w:ilvl="6" w:tentative="1">
+      <w:start w:val="1"/>
+      <w:numFmt w:val="bullet"/>
+      <w:lvlText w:val=""/>
+      <w:lvlJc w:val="left"/>
+      <w:pPr>
+        <w:tabs>
+          <w:tab w:val="num" w:pos="5040"/>
+        </w:tabs>
+        <w:ind w:left="5040" w:hanging="360"/>
+      </w:pPr>
+      <w:rPr>
+        <w:rFonts w:ascii="Wingdings" w:hAnsi="Wingdings" w:hint="default"/>
+        <w:sz w:val="20"/>
+      </w:rPr>
+    </w:lvl>
+    <w:lvl w:ilvl="7" w:tentative="1">
+      <w:start w:val="1"/>
+      <w:numFmt w:val="bullet"/>
+      <w:lvlText w:val=""/>
+      <w:lvlJc w:val="left"/>
+      <w:pPr>
+        <w:tabs>
+          <w:tab w:val="num" w:pos="5760"/>
+        </w:tabs>
+        <w:ind w:left="5760" w:hanging="360"/>
+      </w:pPr>
+      <w:rPr>
+        <w:rFonts w:ascii="Wingdings" w:hAnsi="Wingdings" w:hint="default"/>
+        <w:sz w:val="20"/>
+      </w:rPr>
+    </w:lvl>
+    <w:lvl w:ilvl="8" w:tentative="1">
+      <w:start w:val="1"/>
+      <w:numFmt w:val="bullet"/>
+      <w:lvlText w:val=""/>
+      <w:lvlJc w:val="left"/>
+      <w:pPr>
+        <w:tabs>
+          <w:tab w:val="num" w:pos="6480"/>
+        </w:tabs>
+        <w:ind w:left="6480" w:hanging="360"/>
+      </w:pPr>
+      <w:rPr>
+        <w:rFonts w:ascii="Wingdings" w:hAnsi="Wingdings" w:hint="default"/>
+        <w:sz w:val="20"/>
+      </w:rPr>
+    </w:lvl>
+  </w:abstractNum>
+  <w:num w:numId="1" w16cid:durableId="1051735620">
     <w:abstractNumId w:val="0"/>
   </w:num>
-  <w:num w:numId="3" w16cid:durableId="577130459">
+  <w:num w:numId="2" w16cid:durableId="1180045080">
+    <w:abstractNumId w:val="5"/>
+  </w:num>
+  <w:num w:numId="3" w16cid:durableId="543297708">
+    <w:abstractNumId w:val="1"/>
+  </w:num>
+  <w:num w:numId="4" w16cid:durableId="843591688">
+    <w:abstractNumId w:val="3"/>
+  </w:num>
+  <w:num w:numId="5" w16cid:durableId="873033274">
     <w:abstractNumId w:val="2"/>
   </w:num>
-  <w:num w:numId="4" w16cid:durableId="1483428037">
-    <w:abstractNumId w:val="1"/>
-  </w:num>
-  <w:num w:numId="5" w16cid:durableId="1819422879">
-    <w:abstractNumId w:val="3"/>
+  <w:num w:numId="6" w16cid:durableId="693576613">
+    <w:abstractNumId w:val="4"/>
   </w:num>
 </w:numbering>
 </file>

</xml_diff>

<commit_message>
docs: regenerar Modo de uso.docx con referencia genérica al Agente
Generado con ConvertFrom-Markdown + Word COM desde el .md actualizado.

Co-Authored-By: Claude Sonnet 5 <noreply@anthropic.com>
</commit_message>
<xml_diff>
--- a/Modo de Uso/Modo de uso.docx
+++ b/Modo de Uso/Modo de uso.docx
@@ -6,26 +6,26 @@
       <w:pPr>
         <w:pStyle w:val="Ttulo1"/>
         <w:rPr>
-          <w:rFonts w:ascii="Calibri" w:eastAsia="Times New Roman" w:hAnsi="Calibri" w:cs="Calibri"/>
-        </w:rPr>
-      </w:pPr>
-      <w:r>
-        <w:rPr>
-          <w:rFonts w:ascii="Calibri" w:eastAsia="Times New Roman" w:hAnsi="Calibri" w:cs="Calibri"/>
-        </w:rPr>
-        <w:t>Modo de Uso — SDD Híbrido (Claude + Copilot)</w:t>
+          <w:rFonts w:eastAsia="Times New Roman"/>
+        </w:rPr>
+      </w:pPr>
+      <w:r>
+        <w:rPr>
+          <w:rFonts w:eastAsia="Times New Roman"/>
+        </w:rPr>
+        <w:t>Modo de Uso — SDD Híbrido (Claude + Agente)</w:t>
       </w:r>
     </w:p>
     <w:p>
       <w:pPr>
         <w:pStyle w:val="Ttulo2"/>
         <w:rPr>
-          <w:rFonts w:ascii="Calibri" w:eastAsia="Times New Roman" w:hAnsi="Calibri" w:cs="Calibri"/>
-        </w:rPr>
-      </w:pPr>
-      <w:r>
-        <w:rPr>
-          <w:rFonts w:ascii="Calibri" w:eastAsia="Times New Roman" w:hAnsi="Calibri" w:cs="Calibri"/>
+          <w:rFonts w:eastAsia="Times New Roman"/>
+        </w:rPr>
+      </w:pPr>
+      <w:r>
+        <w:rPr>
+          <w:rFonts w:eastAsia="Times New Roman"/>
         </w:rPr>
         <w:t>Inicio de proyecto</w:t>
       </w:r>
@@ -33,18 +33,8 @@
     <w:p>
       <w:pPr>
         <w:pStyle w:val="NormalWeb"/>
-        <w:rPr>
-          <w:rFonts w:ascii="Calibri" w:hAnsi="Calibri" w:cs="Calibri"/>
-          <w:sz w:val="22"/>
-          <w:szCs w:val="22"/>
-        </w:rPr>
-      </w:pPr>
-      <w:r>
-        <w:rPr>
-          <w:rFonts w:ascii="Calibri" w:hAnsi="Calibri" w:cs="Calibri"/>
-          <w:sz w:val="22"/>
-          <w:szCs w:val="22"/>
-        </w:rPr>
+      </w:pPr>
+      <w:r>
         <w:t>Estos son los pasos exactos a correr en tu terminal, dentro del proyecto:</w:t>
       </w:r>
     </w:p>
@@ -52,12 +42,12 @@
       <w:pPr>
         <w:pStyle w:val="Ttulo3"/>
         <w:rPr>
-          <w:rFonts w:ascii="Calibri" w:eastAsia="Times New Roman" w:hAnsi="Calibri" w:cs="Calibri"/>
-        </w:rPr>
-      </w:pPr>
-      <w:r>
-        <w:rPr>
-          <w:rFonts w:ascii="Calibri" w:eastAsia="Times New Roman" w:hAnsi="Calibri" w:cs="Calibri"/>
+          <w:rFonts w:eastAsia="Times New Roman"/>
+        </w:rPr>
+      </w:pPr>
+      <w:r>
+        <w:rPr>
+          <w:rFonts w:eastAsia="Times New Roman"/>
         </w:rPr>
         <w:t>Paso 1 — Init</w:t>
       </w:r>
@@ -87,19 +77,63 @@
         <w:rPr>
           <w:rStyle w:val="CdigoHTML"/>
         </w:rPr>
-        <w:t>openspec init --tools claude,copilot</w:t>
+        <w:t>openspec init --tools claude,&lt;agente&gt;</w:t>
+      </w:r>
+    </w:p>
+    <w:p>
+      <w:pPr>
+        <w:pStyle w:val="NormalWeb"/>
+      </w:pPr>
+      <w:r>
+        <w:t xml:space="preserve">Reemplazar </w:t>
+      </w:r>
+      <w:r>
+        <w:rPr>
+          <w:rStyle w:val="CdigoHTML"/>
+        </w:rPr>
+        <w:t>&lt;agente&gt;</w:t>
+      </w:r>
+      <w:r>
+        <w:t xml:space="preserve"> por el id de tu agente constructor (</w:t>
+      </w:r>
+      <w:r>
+        <w:rPr>
+          <w:rStyle w:val="CdigoHTML"/>
+        </w:rPr>
+        <w:t>copilot</w:t>
+      </w:r>
+      <w:r>
+        <w:t xml:space="preserve">, </w:t>
+      </w:r>
+      <w:r>
+        <w:rPr>
+          <w:rStyle w:val="CdigoHTML"/>
+        </w:rPr>
+        <w:t>antigravity</w:t>
+      </w:r>
+      <w:r>
+        <w:t xml:space="preserve">, etc. — ver </w:t>
+      </w:r>
+      <w:r>
+        <w:rPr>
+          <w:rStyle w:val="CdigoHTML"/>
+        </w:rPr>
+        <w:t>openspec init --help</w:t>
+      </w:r>
+      <w:r>
+        <w:t>).</w:t>
       </w:r>
     </w:p>
     <w:p>
       <w:pPr>
         <w:pStyle w:val="Ttulo3"/>
         <w:rPr>
-          <w:rFonts w:ascii="Calibri" w:eastAsia="Times New Roman" w:hAnsi="Calibri" w:cs="Calibri"/>
-        </w:rPr>
-      </w:pPr>
-      <w:r>
-        <w:rPr>
-          <w:rFonts w:ascii="Calibri" w:eastAsia="Times New Roman" w:hAnsi="Calibri" w:cs="Calibri"/>
+          <w:rFonts w:eastAsia="Times New Roman"/>
+        </w:rPr>
+      </w:pPr>
+      <w:r>
+        <w:rPr>
+          <w:rFonts w:eastAsia="Times New Roman"/>
         </w:rPr>
         <w:t>Paso 2 — Liberar el slot de apply</w:t>
       </w:r>
@@ -107,11 +141,6 @@
     <w:p>
       <w:pPr>
         <w:pStyle w:val="NormalWeb"/>
-        <w:rPr>
-          <w:rFonts w:ascii="Calibri" w:hAnsi="Calibri" w:cs="Calibri"/>
-          <w:sz w:val="22"/>
-          <w:szCs w:val="22"/>
-        </w:rPr>
       </w:pPr>
       <w:r>
         <w:rPr>
@@ -120,11 +149,6 @@
         <w:t>openspec init</w:t>
       </w:r>
       <w:r>
-        <w:rPr>
-          <w:rFonts w:ascii="Calibri" w:hAnsi="Calibri" w:cs="Calibri"/>
-          <w:sz w:val="22"/>
-          <w:szCs w:val="22"/>
-        </w:rPr>
         <w:t xml:space="preserve"> crea </w:t>
       </w:r>
       <w:r>
@@ -134,20 +158,10 @@
         <w:t>.claude\skills\openspec-apply-change\SKILL.md</w:t>
       </w:r>
       <w:r>
-        <w:rPr>
-          <w:rFonts w:ascii="Calibri" w:hAnsi="Calibri" w:cs="Calibri"/>
-          <w:sz w:val="22"/>
-          <w:szCs w:val="22"/>
-        </w:rPr>
         <w:t xml:space="preserve"> </w:t>
       </w:r>
       <w:r>
-        <w:rPr>
-          <w:rFonts w:ascii="Calibri" w:hAnsi="Calibri" w:cs="Calibri"/>
-          <w:sz w:val="22"/>
-          <w:szCs w:val="22"/>
-        </w:rPr>
-        <w:t>con el comportamiento default donde Claude escribe código. Al borrarlo, el directorio queda vacío y Claude Code cae al skill global modificado — el que anuncia handoff a Copilot en vez de escribir código.</w:t>
+        <w:t>con el comportamiento default donde Claude escribe código. Al borrarlo, el directorio queda vacío y Claude Code cae al skill global modificado — el que anuncia handoff al Agente en vez de escribir código.</w:t>
       </w:r>
     </w:p>
     <w:p>
@@ -167,60 +181,37 @@
     <w:p>
       <w:pPr>
         <w:pStyle w:val="NormalWeb"/>
-        <w:divId w:val="213548435"/>
-        <w:rPr>
-          <w:rFonts w:ascii="Calibri" w:hAnsi="Calibri" w:cs="Calibri"/>
-          <w:color w:val="555555"/>
-          <w:sz w:val="22"/>
-          <w:szCs w:val="22"/>
-        </w:rPr>
+        <w:divId w:val="616134484"/>
       </w:pPr>
       <w:r>
         <w:rPr>
           <w:rStyle w:val="Fuerte"/>
-          <w:rFonts w:ascii="Calibri" w:hAnsi="Calibri" w:cs="Calibri"/>
-          <w:color w:val="555555"/>
-          <w:sz w:val="22"/>
-          <w:szCs w:val="22"/>
         </w:rPr>
         <w:t>Nota:</w:t>
       </w:r>
       <w:r>
-        <w:rPr>
-          <w:rFonts w:ascii="Calibri" w:hAnsi="Calibri" w:cs="Calibri"/>
-          <w:color w:val="555555"/>
-          <w:sz w:val="22"/>
-          <w:szCs w:val="22"/>
-        </w:rPr>
         <w:t xml:space="preserve"> </w:t>
       </w:r>
       <w:r>
         <w:rPr>
           <w:rStyle w:val="CdigoHTML"/>
-          <w:color w:val="555555"/>
         </w:rPr>
         <w:t>.agent\skills\openspec-apply-change\SKILL.md</w:t>
       </w:r>
       <w:r>
-        <w:rPr>
-          <w:rFonts w:ascii="Calibri" w:hAnsi="Calibri" w:cs="Calibri"/>
-          <w:color w:val="555555"/>
-          <w:sz w:val="22"/>
-          <w:szCs w:val="22"/>
-        </w:rPr>
-        <w:t xml:space="preserve"> es distinto — lo usa Copilot, no Claude Code. No borrarlo.</w:t>
+        <w:t xml:space="preserve"> es distinto — lo usa el Agente, no Claude Code. No borrarlo.</w:t>
       </w:r>
     </w:p>
     <w:p>
       <w:pPr>
         <w:pStyle w:val="Ttulo3"/>
         <w:rPr>
-          <w:rFonts w:ascii="Calibri" w:eastAsia="Times New Roman" w:hAnsi="Calibri" w:cs="Calibri"/>
-        </w:rPr>
-      </w:pPr>
-      <w:r>
-        <w:rPr>
-          <w:rFonts w:ascii="Calibri" w:eastAsia="Times New Roman" w:hAnsi="Calibri" w:cs="Calibri"/>
+          <w:rFonts w:eastAsia="Times New Roman"/>
+        </w:rPr>
+      </w:pPr>
+      <w:r>
+        <w:rPr>
+          <w:rFonts w:eastAsia="Times New Roman"/>
         </w:rPr>
         <w:t>Paso 3 — Completar openspec/config.yaml</w:t>
       </w:r>
@@ -228,18 +219,8 @@
     <w:p>
       <w:pPr>
         <w:pStyle w:val="NormalWeb"/>
-        <w:rPr>
-          <w:rFonts w:ascii="Calibri" w:hAnsi="Calibri" w:cs="Calibri"/>
-          <w:sz w:val="22"/>
-          <w:szCs w:val="22"/>
-        </w:rPr>
-      </w:pPr>
-      <w:r>
-        <w:rPr>
-          <w:rFonts w:ascii="Calibri" w:hAnsi="Calibri" w:cs="Calibri"/>
-          <w:sz w:val="22"/>
-          <w:szCs w:val="22"/>
-        </w:rPr>
+      </w:pPr>
+      <w:r>
         <w:t>Decile a Claude qué hace el proyecto (frontend, backend, fullstack, qué stack usa) y te arma el config completo.</w:t>
       </w:r>
     </w:p>
@@ -247,12 +228,12 @@
       <w:pPr>
         <w:pStyle w:val="Ttulo3"/>
         <w:rPr>
-          <w:rFonts w:ascii="Calibri" w:eastAsia="Times New Roman" w:hAnsi="Calibri" w:cs="Calibri"/>
-        </w:rPr>
-      </w:pPr>
-      <w:r>
-        <w:rPr>
-          <w:rFonts w:ascii="Calibri" w:eastAsia="Times New Roman" w:hAnsi="Calibri" w:cs="Calibri"/>
+          <w:rFonts w:eastAsia="Times New Roman"/>
+        </w:rPr>
+      </w:pPr>
+      <w:r>
+        <w:rPr>
+          <w:rFonts w:eastAsia="Times New Roman"/>
         </w:rPr>
         <w:t xml:space="preserve">Paso 4 — Verificar que </w:t>
       </w:r>
@@ -264,7 +245,7 @@
       </w:r>
       <w:r>
         <w:rPr>
-          <w:rFonts w:ascii="Calibri" w:eastAsia="Times New Roman" w:hAnsi="Calibri" w:cs="Calibri"/>
+          <w:rFonts w:eastAsia="Times New Roman"/>
         </w:rPr>
         <w:t xml:space="preserve"> sigue intacto</w:t>
       </w:r>
@@ -286,18 +267,8 @@
     <w:p>
       <w:pPr>
         <w:pStyle w:val="NormalWeb"/>
-        <w:rPr>
-          <w:rFonts w:ascii="Calibri" w:hAnsi="Calibri" w:cs="Calibri"/>
-          <w:sz w:val="22"/>
-          <w:szCs w:val="22"/>
-        </w:rPr>
-      </w:pPr>
-      <w:r>
-        <w:rPr>
-          <w:rFonts w:ascii="Calibri" w:hAnsi="Calibri" w:cs="Calibri"/>
-          <w:sz w:val="22"/>
-          <w:szCs w:val="22"/>
-        </w:rPr>
+      </w:pPr>
+      <w:r>
         <w:t xml:space="preserve">Debe mostrar </w:t>
       </w:r>
       <w:r>
@@ -307,44 +278,29 @@
         <w:t>SKILL.md</w:t>
       </w:r>
       <w:r>
-        <w:rPr>
-          <w:rFonts w:ascii="Calibri" w:hAnsi="Calibri" w:cs="Calibri"/>
-          <w:sz w:val="22"/>
-          <w:szCs w:val="22"/>
-        </w:rPr>
-        <w:t xml:space="preserve"> — ese es el que usa Copilot para implementar. Nunca borrarlo.</w:t>
+        <w:t xml:space="preserve"> — ese es el que usa el Agente para implementar. Nunca borrarlo.</w:t>
       </w:r>
     </w:p>
     <w:p>
       <w:pPr>
         <w:pStyle w:val="Ttulo3"/>
         <w:rPr>
-          <w:rFonts w:ascii="Calibri" w:eastAsia="Times New Roman" w:hAnsi="Calibri" w:cs="Calibri"/>
-        </w:rPr>
-      </w:pPr>
-      <w:r>
-        <w:rPr>
-          <w:rFonts w:ascii="Calibri" w:eastAsia="Times New Roman" w:hAnsi="Calibri" w:cs="Calibri"/>
-        </w:rPr>
-        <w:t>Paso 5 — Instalar instrucciones de Copilot</w:t>
+          <w:rFonts w:eastAsia="Times New Roman"/>
+        </w:rPr>
+      </w:pPr>
+      <w:r>
+        <w:rPr>
+          <w:rFonts w:eastAsia="Times New Roman"/>
+        </w:rPr>
+        <w:t>Paso 5 — Instalar instrucciones del Agente</w:t>
       </w:r>
     </w:p>
     <w:p>
       <w:pPr>
         <w:pStyle w:val="NormalWeb"/>
-        <w:rPr>
-          <w:rFonts w:ascii="Calibri" w:hAnsi="Calibri" w:cs="Calibri"/>
-          <w:sz w:val="22"/>
-          <w:szCs w:val="22"/>
-        </w:rPr>
-      </w:pPr>
-      <w:r>
-        <w:rPr>
-          <w:rFonts w:ascii="Calibri" w:hAnsi="Calibri" w:cs="Calibri"/>
-          <w:sz w:val="22"/>
-          <w:szCs w:val="22"/>
-        </w:rPr>
-        <w:t xml:space="preserve">Copilot no carga configuración global — lee </w:t>
+      </w:pPr>
+      <w:r>
+        <w:t>El Agente no carga la configuración global de Claude — lee las instrucciones del repo donde trabaja (</w:t>
       </w:r>
       <w:r>
         <w:rPr>
@@ -353,12 +309,7 @@
         <w:t>.github\copilot-instructions.md</w:t>
       </w:r>
       <w:r>
-        <w:rPr>
-          <w:rFonts w:ascii="Calibri" w:hAnsi="Calibri" w:cs="Calibri"/>
-          <w:sz w:val="22"/>
-          <w:szCs w:val="22"/>
-        </w:rPr>
-        <w:t xml:space="preserve"> del repo donde trabaja. Copiar la plantilla del repo de configuración:</w:t>
+        <w:t>). Copiar la plantilla del repo de configuración:</w:t>
       </w:r>
     </w:p>
     <w:p>
@@ -386,24 +337,15 @@
         <w:rPr>
           <w:rStyle w:val="CdigoHTML"/>
         </w:rPr>
+        <w:lastRenderedPageBreak/>
         <w:t>cp "$env:SDD_CONFIG_REPO\templates\copilot-instructions.md" .github\copilot-instructions.md</w:t>
       </w:r>
     </w:p>
     <w:p>
       <w:pPr>
         <w:pStyle w:val="NormalWeb"/>
-        <w:rPr>
-          <w:rFonts w:ascii="Calibri" w:hAnsi="Calibri" w:cs="Calibri"/>
-          <w:sz w:val="22"/>
-          <w:szCs w:val="22"/>
-        </w:rPr>
-      </w:pPr>
-      <w:r>
-        <w:rPr>
-          <w:rFonts w:ascii="Calibri" w:hAnsi="Calibri" w:cs="Calibri"/>
-          <w:sz w:val="22"/>
-          <w:szCs w:val="22"/>
-        </w:rPr>
+      </w:pPr>
+      <w:r>
         <w:t xml:space="preserve">Si el proyecto ya tiene un </w:t>
       </w:r>
       <w:r>
@@ -413,11 +355,6 @@
         <w:t>copilot-instructions.md</w:t>
       </w:r>
       <w:r>
-        <w:rPr>
-          <w:rFonts w:ascii="Calibri" w:hAnsi="Calibri" w:cs="Calibri"/>
-          <w:sz w:val="22"/>
-          <w:szCs w:val="22"/>
-        </w:rPr>
         <w:t xml:space="preserve"> propio, fusionar la sección "Workflow SDD" al principio en vez de reemplazarlo.</w:t>
       </w:r>
     </w:p>
@@ -425,14 +362,13 @@
       <w:pPr>
         <w:pStyle w:val="Ttulo3"/>
         <w:rPr>
-          <w:rFonts w:ascii="Calibri" w:eastAsia="Times New Roman" w:hAnsi="Calibri" w:cs="Calibri"/>
-        </w:rPr>
-      </w:pPr>
-      <w:r>
-        <w:rPr>
-          <w:rFonts w:ascii="Calibri" w:eastAsia="Times New Roman" w:hAnsi="Calibri" w:cs="Calibri"/>
-        </w:rPr>
-        <w:lastRenderedPageBreak/>
+          <w:rFonts w:eastAsia="Times New Roman"/>
+        </w:rPr>
+      </w:pPr>
+      <w:r>
+        <w:rPr>
+          <w:rFonts w:eastAsia="Times New Roman"/>
+        </w:rPr>
         <w:t xml:space="preserve">Paso 6 — Verificar el </w:t>
       </w:r>
       <w:r>
@@ -445,18 +381,8 @@
     <w:p>
       <w:pPr>
         <w:pStyle w:val="NormalWeb"/>
-        <w:rPr>
-          <w:rFonts w:ascii="Calibri" w:hAnsi="Calibri" w:cs="Calibri"/>
-          <w:sz w:val="22"/>
-          <w:szCs w:val="22"/>
-        </w:rPr>
-      </w:pPr>
-      <w:r>
-        <w:rPr>
-          <w:rFonts w:ascii="Calibri" w:hAnsi="Calibri" w:cs="Calibri"/>
-          <w:sz w:val="22"/>
-          <w:szCs w:val="22"/>
-        </w:rPr>
+      </w:pPr>
+      <w:r>
         <w:t xml:space="preserve">Si el proyecto no tiene </w:t>
       </w:r>
       <w:r>
@@ -466,11 +392,6 @@
         <w:t>.gitignore</w:t>
       </w:r>
       <w:r>
-        <w:rPr>
-          <w:rFonts w:ascii="Calibri" w:hAnsi="Calibri" w:cs="Calibri"/>
-          <w:sz w:val="22"/>
-          <w:szCs w:val="22"/>
-        </w:rPr>
         <w:t xml:space="preserve">, crearlo antes del primer commit. Mínimo obligatorio: </w:t>
       </w:r>
       <w:r>
@@ -480,11 +401,6 @@
         <w:t>.env</w:t>
       </w:r>
       <w:r>
-        <w:rPr>
-          <w:rFonts w:ascii="Calibri" w:hAnsi="Calibri" w:cs="Calibri"/>
-          <w:sz w:val="22"/>
-          <w:szCs w:val="22"/>
-        </w:rPr>
         <w:t xml:space="preserve">, </w:t>
       </w:r>
       <w:r>
@@ -494,11 +410,6 @@
         <w:t>*.env</w:t>
       </w:r>
       <w:r>
-        <w:rPr>
-          <w:rFonts w:ascii="Calibri" w:hAnsi="Calibri" w:cs="Calibri"/>
-          <w:sz w:val="22"/>
-          <w:szCs w:val="22"/>
-        </w:rPr>
         <w:t xml:space="preserve">, </w:t>
       </w:r>
       <w:r>
@@ -508,11 +419,6 @@
         <w:t>*.key</w:t>
       </w:r>
       <w:r>
-        <w:rPr>
-          <w:rFonts w:ascii="Calibri" w:hAnsi="Calibri" w:cs="Calibri"/>
-          <w:sz w:val="22"/>
-          <w:szCs w:val="22"/>
-        </w:rPr>
         <w:t xml:space="preserve">, </w:t>
       </w:r>
       <w:r>
@@ -522,11 +428,6 @@
         <w:t>*.pem</w:t>
       </w:r>
       <w:r>
-        <w:rPr>
-          <w:rFonts w:ascii="Calibri" w:hAnsi="Calibri" w:cs="Calibri"/>
-          <w:sz w:val="22"/>
-          <w:szCs w:val="22"/>
-        </w:rPr>
         <w:t xml:space="preserve">, </w:t>
       </w:r>
       <w:r>
@@ -536,29 +437,20 @@
         <w:t>secrets/</w:t>
       </w:r>
       <w:r>
-        <w:rPr>
-          <w:rFonts w:ascii="Calibri" w:hAnsi="Calibri" w:cs="Calibri"/>
-          <w:sz w:val="22"/>
-          <w:szCs w:val="22"/>
-        </w:rPr>
         <w:t>.</w:t>
       </w:r>
     </w:p>
     <w:p>
       <w:pPr>
         <w:rPr>
-          <w:rFonts w:ascii="Calibri" w:eastAsia="Times New Roman" w:hAnsi="Calibri" w:cs="Calibri"/>
-          <w:sz w:val="22"/>
-          <w:szCs w:val="22"/>
-        </w:rPr>
-      </w:pPr>
-      <w:r>
-        <w:rPr>
-          <w:rFonts w:ascii="Calibri" w:eastAsia="Times New Roman" w:hAnsi="Calibri" w:cs="Calibri"/>
-          <w:sz w:val="22"/>
-          <w:szCs w:val="22"/>
-        </w:rPr>
-        <w:pict w14:anchorId="77C54695">
+          <w:rFonts w:eastAsia="Times New Roman"/>
+        </w:rPr>
+      </w:pPr>
+      <w:r>
+        <w:rPr>
+          <w:rFonts w:eastAsia="Times New Roman"/>
+        </w:rPr>
+        <w:pict w14:anchorId="78ABEE39">
           <v:rect id="_x0000_i1025" style="width:0;height:1.5pt" o:hralign="center" o:hrstd="t" o:hr="t" fillcolor="#a0a0a0" stroked="f"/>
         </w:pict>
       </w:r>
@@ -567,12 +459,12 @@
       <w:pPr>
         <w:pStyle w:val="Ttulo2"/>
         <w:rPr>
-          <w:rFonts w:ascii="Calibri" w:eastAsia="Times New Roman" w:hAnsi="Calibri" w:cs="Calibri"/>
-        </w:rPr>
-      </w:pPr>
-      <w:r>
-        <w:rPr>
-          <w:rFonts w:ascii="Calibri" w:eastAsia="Times New Roman" w:hAnsi="Calibri" w:cs="Calibri"/>
+          <w:rFonts w:eastAsia="Times New Roman"/>
+        </w:rPr>
+      </w:pPr>
+      <w:r>
+        <w:rPr>
+          <w:rFonts w:eastAsia="Times New Roman"/>
         </w:rPr>
         <w:t>Setup por máquina (una sola vez, no por proyecto)</w:t>
       </w:r>
@@ -580,18 +472,8 @@
     <w:p>
       <w:pPr>
         <w:pStyle w:val="NormalWeb"/>
-        <w:rPr>
-          <w:rFonts w:ascii="Calibri" w:hAnsi="Calibri" w:cs="Calibri"/>
-          <w:sz w:val="22"/>
-          <w:szCs w:val="22"/>
-        </w:rPr>
-      </w:pPr>
-      <w:r>
-        <w:rPr>
-          <w:rFonts w:ascii="Calibri" w:hAnsi="Calibri" w:cs="Calibri"/>
-          <w:sz w:val="22"/>
-          <w:szCs w:val="22"/>
-        </w:rPr>
+      </w:pPr>
+      <w:r>
         <w:t xml:space="preserve">Detalle completo en el README del repo </w:t>
       </w:r>
       <w:r>
@@ -601,11 +483,6 @@
         <w:t>sdd-global-config</w:t>
       </w:r>
       <w:r>
-        <w:rPr>
-          <w:rFonts w:ascii="Calibri" w:hAnsi="Calibri" w:cs="Calibri"/>
-          <w:sz w:val="22"/>
-          <w:szCs w:val="22"/>
-        </w:rPr>
         <w:t>. Resumen:</w:t>
       </w:r>
     </w:p>
@@ -670,7 +547,7 @@
         <w:rPr>
           <w:rStyle w:val="CdigoHTML"/>
         </w:rPr>
-        <w:t># Contexto global de Gemini</w:t>
+        <w:t># Contexto global del Agente</w:t>
       </w:r>
     </w:p>
     <w:p>
@@ -734,42 +611,43 @@
         <w:rPr>
           <w:rStyle w:val="CdigoHTML"/>
         </w:rPr>
-        <w:t>$env:SDD_CONFIG_REPO = "C:\ruta\a\sdd-global-config"  # dónde quedó clonado el repo</w:t>
+        <w:t>$env:SDD_CONFIG_REPO = "</w:t>
+      </w:r>
+      <w:r>
+        <w:rPr>
+          <w:rStyle w:val="CdigoHTML"/>
+        </w:rPr>
+        <w:t>C:\ruta\a\sdd-global-config"  # dónde quedó clonado el repo</w:t>
       </w:r>
     </w:p>
     <w:p>
       <w:pPr>
         <w:pStyle w:val="NormalWeb"/>
-        <w:rPr>
-          <w:rFonts w:ascii="Calibri" w:hAnsi="Calibri" w:cs="Calibri"/>
-          <w:sz w:val="22"/>
-          <w:szCs w:val="22"/>
-        </w:rPr>
-      </w:pPr>
-      <w:r>
-        <w:rPr>
-          <w:rFonts w:ascii="Calibri" w:hAnsi="Calibri" w:cs="Calibri"/>
-          <w:sz w:val="22"/>
-          <w:szCs w:val="22"/>
-        </w:rPr>
-        <w:t>Claude y Gemini cargan su configuración global en todos los proyectos — solo Copilot necesita el paso 5 por proyecto.</w:t>
-      </w:r>
-    </w:p>
-    <w:p>
-      <w:pPr>
-        <w:rPr>
-          <w:rFonts w:ascii="Calibri" w:eastAsia="Times New Roman" w:hAnsi="Calibri" w:cs="Calibri"/>
-          <w:sz w:val="22"/>
-          <w:szCs w:val="22"/>
-        </w:rPr>
-      </w:pPr>
-      <w:r>
-        <w:rPr>
-          <w:rFonts w:ascii="Calibri" w:eastAsia="Times New Roman" w:hAnsi="Calibri" w:cs="Calibri"/>
-          <w:sz w:val="22"/>
-          <w:szCs w:val="22"/>
-        </w:rPr>
-        <w:pict w14:anchorId="6631B55E">
+      </w:pPr>
+      <w:r>
+        <w:t xml:space="preserve">Claude y el Agente cargan su configuración global en todos los proyectos; el paso 5 por proyecto aplica al agente que lee </w:t>
+      </w:r>
+      <w:r>
+        <w:rPr>
+          <w:rStyle w:val="CdigoHTML"/>
+        </w:rPr>
+        <w:t>.github\copilot-instructions.md</w:t>
+      </w:r>
+      <w:r>
+        <w:t>.</w:t>
+      </w:r>
+    </w:p>
+    <w:p>
+      <w:pPr>
+        <w:rPr>
+          <w:rFonts w:eastAsia="Times New Roman"/>
+        </w:rPr>
+      </w:pPr>
+      <w:r>
+        <w:rPr>
+          <w:rFonts w:eastAsia="Times New Roman"/>
+        </w:rPr>
+        <w:pict w14:anchorId="76DEEC87">
           <v:rect id="_x0000_i1026" style="width:0;height:1.5pt" o:hralign="center" o:hrstd="t" o:hr="t" fillcolor="#a0a0a0" stroked="f"/>
         </w:pict>
       </w:r>
@@ -778,12 +656,12 @@
       <w:pPr>
         <w:pStyle w:val="Ttulo2"/>
         <w:rPr>
-          <w:rFonts w:ascii="Calibri" w:eastAsia="Times New Roman" w:hAnsi="Calibri" w:cs="Calibri"/>
-        </w:rPr>
-      </w:pPr>
-      <w:r>
-        <w:rPr>
-          <w:rFonts w:ascii="Calibri" w:eastAsia="Times New Roman" w:hAnsi="Calibri" w:cs="Calibri"/>
+          <w:rFonts w:eastAsia="Times New Roman"/>
+        </w:rPr>
+      </w:pPr>
+      <w:r>
+        <w:rPr>
+          <w:rFonts w:eastAsia="Times New Roman"/>
         </w:rPr>
         <w:t>Flujo por change</w:t>
       </w:r>
@@ -827,7 +705,7 @@
         <w:rPr>
           <w:rStyle w:val="CdigoHTML"/>
         </w:rPr>
-        <w:t>Copilot  /openspec-apply-change        → implementa en el branch, commitea con Spec-ID:</w:t>
+        <w:t>Agente   /openspec-apply-change        → implementa en el branch, commitea con Spec-ID:</w:t>
       </w:r>
     </w:p>
     <w:p>
@@ -841,7 +719,13 @@
         <w:rPr>
           <w:rStyle w:val="CdigoHTML"/>
         </w:rPr>
-        <w:t>Claude   /branch-pr &lt;nombre&gt;           → valida commits, abre PR desde Obsidian decisions/</w:t>
+        <w:t xml:space="preserve">Claude   </w:t>
+      </w:r>
+      <w:r>
+        <w:rPr>
+          <w:rStyle w:val="CdigoHTML"/>
+        </w:rPr>
+        <w:t>/branch-pr &lt;nombre&gt;           → valida commits, abre PR desde Obsidian decisions/</w:t>
       </w:r>
     </w:p>
     <w:p>
@@ -855,13 +739,7 @@
         <w:rPr>
           <w:rStyle w:val="CdigoHTML"/>
         </w:rPr>
-        <w:t>Claude   /opsx:verify &lt;</w:t>
-      </w:r>
-      <w:r>
-        <w:rPr>
-          <w:rStyle w:val="CdigoHTML"/>
-        </w:rPr>
-        <w:t>nombre&gt;         → valida vs specs, actualiza Obsidian context.md</w:t>
+        <w:t>Claude   /opsx:verify &lt;nombre&gt;         → valida vs specs, actualiza Obsidian context.md</w:t>
       </w:r>
     </w:p>
     <w:p>
@@ -895,27 +773,14 @@
     <w:p>
       <w:pPr>
         <w:pStyle w:val="NormalWeb"/>
-        <w:rPr>
-          <w:rFonts w:ascii="Calibri" w:hAnsi="Calibri" w:cs="Calibri"/>
-          <w:sz w:val="22"/>
-          <w:szCs w:val="22"/>
-        </w:rPr>
       </w:pPr>
       <w:r>
         <w:rPr>
           <w:rStyle w:val="Fuerte"/>
-          <w:rFonts w:ascii="Calibri" w:hAnsi="Calibri" w:cs="Calibri"/>
-          <w:sz w:val="22"/>
-          <w:szCs w:val="22"/>
         </w:rPr>
         <w:t>1. Crear issue</w:t>
       </w:r>
       <w:r>
-        <w:rPr>
-          <w:rFonts w:ascii="Calibri" w:hAnsi="Calibri" w:cs="Calibri"/>
-          <w:sz w:val="22"/>
-          <w:szCs w:val="22"/>
-        </w:rPr>
         <w:t xml:space="preserve"> (</w:t>
       </w:r>
       <w:r>
@@ -925,29 +790,15 @@
         <w:t>/issue-creation</w:t>
       </w:r>
       <w:r>
-        <w:rPr>
-          <w:rFonts w:ascii="Calibri" w:hAnsi="Calibri" w:cs="Calibri"/>
-          <w:sz w:val="22"/>
-          <w:szCs w:val="22"/>
-        </w:rPr>
         <w:t>)</w:t>
       </w:r>
     </w:p>
     <w:p>
       <w:pPr>
         <w:pStyle w:val="NormalWeb"/>
-        <w:rPr>
-          <w:rFonts w:ascii="Calibri" w:hAnsi="Calibri" w:cs="Calibri"/>
-          <w:sz w:val="22"/>
-          <w:szCs w:val="22"/>
-        </w:rPr>
-      </w:pPr>
-      <w:r>
-        <w:rPr>
-          <w:rFonts w:ascii="Calibri" w:hAnsi="Calibri" w:cs="Calibri"/>
-          <w:sz w:val="22"/>
-          <w:szCs w:val="22"/>
-        </w:rPr>
+      </w:pPr>
+      <w:r>
+        <w:lastRenderedPageBreak/>
         <w:t xml:space="preserve">Antes de cualquier cambio, creás un issue con el template. Queda en </w:t>
       </w:r>
       <w:r>
@@ -957,11 +808,6 @@
         <w:t>status:needs-review</w:t>
       </w:r>
       <w:r>
-        <w:rPr>
-          <w:rFonts w:ascii="Calibri" w:hAnsi="Calibri" w:cs="Calibri"/>
-          <w:sz w:val="22"/>
-          <w:szCs w:val="22"/>
-        </w:rPr>
         <w:t>. Un maintainer debe aprobar (</w:t>
       </w:r>
       <w:r>
@@ -971,38 +817,20 @@
         <w:t>status:approved</w:t>
       </w:r>
       <w:r>
-        <w:rPr>
-          <w:rFonts w:ascii="Calibri" w:hAnsi="Calibri" w:cs="Calibri"/>
-          <w:sz w:val="22"/>
-          <w:szCs w:val="22"/>
-        </w:rPr>
         <w:t>) antes de continuar.</w:t>
       </w:r>
     </w:p>
     <w:p>
       <w:pPr>
         <w:pStyle w:val="NormalWeb"/>
-        <w:rPr>
-          <w:rFonts w:ascii="Calibri" w:hAnsi="Calibri" w:cs="Calibri"/>
-          <w:sz w:val="22"/>
-          <w:szCs w:val="22"/>
-        </w:rPr>
       </w:pPr>
       <w:r>
         <w:rPr>
           <w:rStyle w:val="Fuerte"/>
-          <w:rFonts w:ascii="Calibri" w:hAnsi="Calibri" w:cs="Calibri"/>
-          <w:sz w:val="22"/>
-          <w:szCs w:val="22"/>
         </w:rPr>
         <w:t>2. Claude propone</w:t>
       </w:r>
       <w:r>
-        <w:rPr>
-          <w:rFonts w:ascii="Calibri" w:hAnsi="Calibri" w:cs="Calibri"/>
-          <w:sz w:val="22"/>
-          <w:szCs w:val="22"/>
-        </w:rPr>
         <w:t xml:space="preserve"> (</w:t>
       </w:r>
       <w:r>
@@ -1012,30 +840,14 @@
         <w:t>/opsx:propose</w:t>
       </w:r>
       <w:r>
-        <w:rPr>
-          <w:rFonts w:ascii="Calibri" w:hAnsi="Calibri" w:cs="Calibri"/>
-          <w:sz w:val="22"/>
-          <w:szCs w:val="22"/>
-        </w:rPr>
         <w:t>)</w:t>
       </w:r>
     </w:p>
     <w:p>
       <w:pPr>
         <w:pStyle w:val="NormalWeb"/>
-        <w:rPr>
-          <w:rFonts w:ascii="Calibri" w:hAnsi="Calibri" w:cs="Calibri"/>
-          <w:sz w:val="22"/>
-          <w:szCs w:val="22"/>
-        </w:rPr>
-      </w:pPr>
-      <w:r>
-        <w:rPr>
-          <w:rFonts w:ascii="Calibri" w:hAnsi="Calibri" w:cs="Calibri"/>
-          <w:sz w:val="22"/>
-          <w:szCs w:val="22"/>
-        </w:rPr>
-        <w:lastRenderedPageBreak/>
+      </w:pPr>
+      <w:r>
         <w:t xml:space="preserve">Lee </w:t>
       </w:r>
       <w:r>
@@ -1045,20 +857,7 @@
         <w:t>context.md</w:t>
       </w:r>
       <w:r>
-        <w:rPr>
-          <w:rFonts w:ascii="Calibri" w:hAnsi="Calibri" w:cs="Calibri"/>
-          <w:sz w:val="22"/>
-          <w:szCs w:val="22"/>
-        </w:rPr>
-        <w:t xml:space="preserve"> </w:t>
-      </w:r>
-      <w:r>
-        <w:rPr>
-          <w:rFonts w:ascii="Calibri" w:hAnsi="Calibri" w:cs="Calibri"/>
-          <w:sz w:val="22"/>
-          <w:szCs w:val="22"/>
-        </w:rPr>
-        <w:t xml:space="preserve">del vault para recuperar contexto previo. Luego crea los artefactos en </w:t>
+        <w:t xml:space="preserve"> del vault para recuperar contexto previo. Luego crea los artefactos en </w:t>
       </w:r>
       <w:r>
         <w:rPr>
@@ -1067,11 +866,6 @@
         <w:t>openspec/changes/nombre-del-change/</w:t>
       </w:r>
       <w:r>
-        <w:rPr>
-          <w:rFonts w:ascii="Calibri" w:hAnsi="Calibri" w:cs="Calibri"/>
-          <w:sz w:val="22"/>
-          <w:szCs w:val="22"/>
-        </w:rPr>
         <w:t>:</w:t>
       </w:r>
     </w:p>
@@ -1083,9 +877,7 @@
         </w:numPr>
         <w:spacing w:before="100" w:beforeAutospacing="1" w:after="100" w:afterAutospacing="1"/>
         <w:rPr>
-          <w:rFonts w:ascii="Calibri" w:eastAsia="Times New Roman" w:hAnsi="Calibri" w:cs="Calibri"/>
-          <w:sz w:val="22"/>
-          <w:szCs w:val="22"/>
+          <w:rFonts w:eastAsia="Times New Roman"/>
         </w:rPr>
       </w:pPr>
       <w:r>
@@ -1096,9 +888,7 @@
       </w:r>
       <w:r>
         <w:rPr>
-          <w:rFonts w:ascii="Calibri" w:eastAsia="Times New Roman" w:hAnsi="Calibri" w:cs="Calibri"/>
-          <w:sz w:val="22"/>
-          <w:szCs w:val="22"/>
+          <w:rFonts w:eastAsia="Times New Roman"/>
         </w:rPr>
         <w:t xml:space="preserve"> — qué se hace y por qué</w:t>
       </w:r>
@@ -1111,9 +901,7 @@
         </w:numPr>
         <w:spacing w:before="100" w:beforeAutospacing="1" w:after="100" w:afterAutospacing="1"/>
         <w:rPr>
-          <w:rFonts w:ascii="Calibri" w:eastAsia="Times New Roman" w:hAnsi="Calibri" w:cs="Calibri"/>
-          <w:sz w:val="22"/>
-          <w:szCs w:val="22"/>
+          <w:rFonts w:eastAsia="Times New Roman"/>
         </w:rPr>
       </w:pPr>
       <w:r>
@@ -1124,9 +912,7 @@
       </w:r>
       <w:r>
         <w:rPr>
-          <w:rFonts w:ascii="Calibri" w:eastAsia="Times New Roman" w:hAnsi="Calibri" w:cs="Calibri"/>
-          <w:sz w:val="22"/>
-          <w:szCs w:val="22"/>
+          <w:rFonts w:eastAsia="Times New Roman"/>
         </w:rPr>
         <w:t xml:space="preserve"> — cómo se hace, con sección </w:t>
       </w:r>
@@ -1145,9 +931,7 @@
         </w:numPr>
         <w:spacing w:before="100" w:beforeAutospacing="1" w:after="100" w:afterAutospacing="1"/>
         <w:rPr>
-          <w:rFonts w:ascii="Calibri" w:eastAsia="Times New Roman" w:hAnsi="Calibri" w:cs="Calibri"/>
-          <w:sz w:val="22"/>
-          <w:szCs w:val="22"/>
+          <w:rFonts w:eastAsia="Times New Roman"/>
         </w:rPr>
       </w:pPr>
       <w:r>
@@ -1158,9 +942,7 @@
       </w:r>
       <w:r>
         <w:rPr>
-          <w:rFonts w:ascii="Calibri" w:eastAsia="Times New Roman" w:hAnsi="Calibri" w:cs="Calibri"/>
-          <w:sz w:val="22"/>
-          <w:szCs w:val="22"/>
+          <w:rFonts w:eastAsia="Times New Roman"/>
         </w:rPr>
         <w:t xml:space="preserve"> — contratos técnicos detallados</w:t>
       </w:r>
@@ -1173,9 +955,7 @@
         </w:numPr>
         <w:spacing w:before="100" w:beforeAutospacing="1" w:after="100" w:afterAutospacing="1"/>
         <w:rPr>
-          <w:rFonts w:ascii="Calibri" w:eastAsia="Times New Roman" w:hAnsi="Calibri" w:cs="Calibri"/>
-          <w:sz w:val="22"/>
-          <w:szCs w:val="22"/>
+          <w:rFonts w:eastAsia="Times New Roman"/>
         </w:rPr>
       </w:pPr>
       <w:r>
@@ -1186,9 +966,7 @@
       </w:r>
       <w:r>
         <w:rPr>
-          <w:rFonts w:ascii="Calibri" w:eastAsia="Times New Roman" w:hAnsi="Calibri" w:cs="Calibri"/>
-          <w:sz w:val="22"/>
-          <w:szCs w:val="22"/>
+          <w:rFonts w:eastAsia="Times New Roman"/>
         </w:rPr>
         <w:t xml:space="preserve"> — lista de tareas con archivos exactos a tocar</w:t>
       </w:r>
@@ -1196,18 +974,8 @@
     <w:p>
       <w:pPr>
         <w:pStyle w:val="NormalWeb"/>
-        <w:rPr>
-          <w:rFonts w:ascii="Calibri" w:hAnsi="Calibri" w:cs="Calibri"/>
-          <w:sz w:val="22"/>
-          <w:szCs w:val="22"/>
-        </w:rPr>
-      </w:pPr>
-      <w:r>
-        <w:rPr>
-          <w:rFonts w:ascii="Calibri" w:hAnsi="Calibri" w:cs="Calibri"/>
-          <w:sz w:val="22"/>
-          <w:szCs w:val="22"/>
-        </w:rPr>
+      </w:pPr>
+      <w:r>
         <w:t xml:space="preserve">Al finalizar: escribe </w:t>
       </w:r>
       <w:r>
@@ -1217,11 +985,6 @@
         <w:t>decisions/YYYY-MM-DD-nombre.md</w:t>
       </w:r>
       <w:r>
-        <w:rPr>
-          <w:rFonts w:ascii="Calibri" w:hAnsi="Calibri" w:cs="Calibri"/>
-          <w:sz w:val="22"/>
-          <w:szCs w:val="22"/>
-        </w:rPr>
         <w:t xml:space="preserve"> en Obsidian, actualiza </w:t>
       </w:r>
       <w:r>
@@ -1231,11 +994,6 @@
         <w:t>context.md</w:t>
       </w:r>
       <w:r>
-        <w:rPr>
-          <w:rFonts w:ascii="Calibri" w:hAnsi="Calibri" w:cs="Calibri"/>
-          <w:sz w:val="22"/>
-          <w:szCs w:val="22"/>
-        </w:rPr>
         <w:t xml:space="preserve"> y crea el branch </w:t>
       </w:r>
       <w:r>
@@ -1245,31 +1003,18 @@
         <w:t>change/nombre-del-change</w:t>
       </w:r>
       <w:r>
-        <w:rPr>
-          <w:rFonts w:ascii="Calibri" w:hAnsi="Calibri" w:cs="Calibri"/>
-          <w:sz w:val="22"/>
-          <w:szCs w:val="22"/>
-        </w:rPr>
         <w:t>.</w:t>
       </w:r>
     </w:p>
     <w:p>
       <w:pPr>
         <w:pStyle w:val="NormalWeb"/>
-        <w:rPr>
-          <w:rFonts w:ascii="Calibri" w:hAnsi="Calibri" w:cs="Calibri"/>
-          <w:sz w:val="22"/>
-          <w:szCs w:val="22"/>
-        </w:rPr>
       </w:pPr>
       <w:r>
         <w:rPr>
           <w:rStyle w:val="Fuerte"/>
-          <w:rFonts w:ascii="Calibri" w:hAnsi="Calibri" w:cs="Calibri"/>
-          <w:sz w:val="22"/>
-          <w:szCs w:val="22"/>
-        </w:rPr>
-        <w:t>3. Copilot implementa</w:t>
+        </w:rPr>
+        <w:t>3. El Agente implementa</w:t>
       </w:r>
     </w:p>
     <w:p>
@@ -1289,19 +1034,9 @@
     <w:p>
       <w:pPr>
         <w:pStyle w:val="NormalWeb"/>
-        <w:rPr>
-          <w:rFonts w:ascii="Calibri" w:hAnsi="Calibri" w:cs="Calibri"/>
-          <w:sz w:val="22"/>
-          <w:szCs w:val="22"/>
-        </w:rPr>
-      </w:pPr>
-      <w:r>
-        <w:rPr>
-          <w:rFonts w:ascii="Calibri" w:hAnsi="Calibri" w:cs="Calibri"/>
-          <w:sz w:val="22"/>
-          <w:szCs w:val="22"/>
-        </w:rPr>
-        <w:t xml:space="preserve">Copilot implementa en el branch, marca las tareas </w:t>
+      </w:pPr>
+      <w:r>
+        <w:t xml:space="preserve">El Agente implementa en el branch, marca las tareas </w:t>
       </w:r>
       <w:r>
         <w:rPr>
@@ -1310,11 +1045,6 @@
         <w:t>[x]</w:t>
       </w:r>
       <w:r>
-        <w:rPr>
-          <w:rFonts w:ascii="Calibri" w:hAnsi="Calibri" w:cs="Calibri"/>
-          <w:sz w:val="22"/>
-          <w:szCs w:val="22"/>
-        </w:rPr>
         <w:t xml:space="preserve"> y commitea con formato:</w:t>
       </w:r>
     </w:p>
@@ -1357,27 +1087,14 @@
     <w:p>
       <w:pPr>
         <w:pStyle w:val="NormalWeb"/>
-        <w:rPr>
-          <w:rFonts w:ascii="Calibri" w:hAnsi="Calibri" w:cs="Calibri"/>
-          <w:sz w:val="22"/>
-          <w:szCs w:val="22"/>
-        </w:rPr>
       </w:pPr>
       <w:r>
         <w:rPr>
           <w:rStyle w:val="Fuerte"/>
-          <w:rFonts w:ascii="Calibri" w:hAnsi="Calibri" w:cs="Calibri"/>
-          <w:sz w:val="22"/>
-          <w:szCs w:val="22"/>
         </w:rPr>
         <w:t>4. Abrir PR</w:t>
       </w:r>
       <w:r>
-        <w:rPr>
-          <w:rFonts w:ascii="Calibri" w:hAnsi="Calibri" w:cs="Calibri"/>
-          <w:sz w:val="22"/>
-          <w:szCs w:val="22"/>
-        </w:rPr>
         <w:t xml:space="preserve"> (</w:t>
       </w:r>
       <w:r>
@@ -1387,11 +1104,6 @@
         <w:t>/branch-pr</w:t>
       </w:r>
       <w:r>
-        <w:rPr>
-          <w:rFonts w:ascii="Calibri" w:hAnsi="Calibri" w:cs="Calibri"/>
-          <w:sz w:val="22"/>
-          <w:szCs w:val="22"/>
-        </w:rPr>
         <w:t>)</w:t>
       </w:r>
     </w:p>
@@ -1412,18 +1124,8 @@
     <w:p>
       <w:pPr>
         <w:pStyle w:val="NormalWeb"/>
-        <w:rPr>
-          <w:rFonts w:ascii="Calibri" w:hAnsi="Calibri" w:cs="Calibri"/>
-          <w:sz w:val="22"/>
-          <w:szCs w:val="22"/>
-        </w:rPr>
-      </w:pPr>
-      <w:r>
-        <w:rPr>
-          <w:rFonts w:ascii="Calibri" w:hAnsi="Calibri" w:cs="Calibri"/>
-          <w:sz w:val="22"/>
-          <w:szCs w:val="22"/>
-        </w:rPr>
+      </w:pPr>
+      <w:r>
         <w:t xml:space="preserve">El skill lee </w:t>
       </w:r>
       <w:r>
@@ -1433,11 +1135,6 @@
         <w:t>decisions/{change}.md</w:t>
       </w:r>
       <w:r>
-        <w:rPr>
-          <w:rFonts w:ascii="Calibri" w:hAnsi="Calibri" w:cs="Calibri"/>
-          <w:sz w:val="22"/>
-          <w:szCs w:val="22"/>
-        </w:rPr>
         <w:t xml:space="preserve"> del vault para armar el body, valida commits y abre la PR con el formato correcto. El GitHub Action </w:t>
       </w:r>
       <w:r>
@@ -1447,11 +1144,6 @@
         <w:t>pr-check.yml</w:t>
       </w:r>
       <w:r>
-        <w:rPr>
-          <w:rFonts w:ascii="Calibri" w:hAnsi="Calibri" w:cs="Calibri"/>
-          <w:sz w:val="22"/>
-          <w:szCs w:val="22"/>
-        </w:rPr>
         <w:t xml:space="preserve"> valida automáticamente branch, título y </w:t>
       </w:r>
       <w:r>
@@ -1461,38 +1153,20 @@
         <w:t>Spec-ID:</w:t>
       </w:r>
       <w:r>
-        <w:rPr>
-          <w:rFonts w:ascii="Calibri" w:hAnsi="Calibri" w:cs="Calibri"/>
-          <w:sz w:val="22"/>
-          <w:szCs w:val="22"/>
-        </w:rPr>
         <w:t>.</w:t>
       </w:r>
     </w:p>
     <w:p>
       <w:pPr>
         <w:pStyle w:val="NormalWeb"/>
-        <w:rPr>
-          <w:rFonts w:ascii="Calibri" w:hAnsi="Calibri" w:cs="Calibri"/>
-          <w:sz w:val="22"/>
-          <w:szCs w:val="22"/>
-        </w:rPr>
       </w:pPr>
       <w:r>
         <w:rPr>
           <w:rStyle w:val="Fuerte"/>
-          <w:rFonts w:ascii="Calibri" w:hAnsi="Calibri" w:cs="Calibri"/>
-          <w:sz w:val="22"/>
-          <w:szCs w:val="22"/>
         </w:rPr>
         <w:t>5. Claude verifica</w:t>
       </w:r>
       <w:r>
-        <w:rPr>
-          <w:rFonts w:ascii="Calibri" w:hAnsi="Calibri" w:cs="Calibri"/>
-          <w:sz w:val="22"/>
-          <w:szCs w:val="22"/>
-        </w:rPr>
         <w:t xml:space="preserve"> (</w:t>
       </w:r>
       <w:r>
@@ -1502,29 +1176,14 @@
         <w:t>/opsx:verify</w:t>
       </w:r>
       <w:r>
-        <w:rPr>
-          <w:rFonts w:ascii="Calibri" w:hAnsi="Calibri" w:cs="Calibri"/>
-          <w:sz w:val="22"/>
-          <w:szCs w:val="22"/>
-        </w:rPr>
         <w:t>)</w:t>
       </w:r>
     </w:p>
     <w:p>
       <w:pPr>
         <w:pStyle w:val="NormalWeb"/>
-        <w:rPr>
-          <w:rFonts w:ascii="Calibri" w:hAnsi="Calibri" w:cs="Calibri"/>
-          <w:sz w:val="22"/>
-          <w:szCs w:val="22"/>
-        </w:rPr>
-      </w:pPr>
-      <w:r>
-        <w:rPr>
-          <w:rFonts w:ascii="Calibri" w:hAnsi="Calibri" w:cs="Calibri"/>
-          <w:sz w:val="22"/>
-          <w:szCs w:val="22"/>
-        </w:rPr>
+      </w:pPr>
+      <w:r>
         <w:t xml:space="preserve">Lee </w:t>
       </w:r>
       <w:r>
@@ -1534,11 +1193,6 @@
         <w:t>tasks.md</w:t>
       </w:r>
       <w:r>
-        <w:rPr>
-          <w:rFonts w:ascii="Calibri" w:hAnsi="Calibri" w:cs="Calibri"/>
-          <w:sz w:val="22"/>
-          <w:szCs w:val="22"/>
-        </w:rPr>
         <w:t xml:space="preserve">, </w:t>
       </w:r>
       <w:r>
@@ -1548,12 +1202,10 @@
         <w:t>git diff</w:t>
       </w:r>
       <w:r>
-        <w:rPr>
-          <w:rFonts w:ascii="Calibri" w:hAnsi="Calibri" w:cs="Calibri"/>
-          <w:sz w:val="22"/>
-          <w:szCs w:val="22"/>
-        </w:rPr>
-        <w:t xml:space="preserve"> y specs. Confirma que Copilot cumplió la spec. Actualiza </w:t>
+        <w:t xml:space="preserve"> </w:t>
+      </w:r>
+      <w:r>
+        <w:t xml:space="preserve">y specs. Confirma que el Agente cumplió la spec. Actualiza </w:t>
       </w:r>
       <w:r>
         <w:rPr>
@@ -1562,46 +1214,20 @@
         <w:t>context.md</w:t>
       </w:r>
       <w:r>
-        <w:rPr>
-          <w:rFonts w:ascii="Calibri" w:hAnsi="Calibri" w:cs="Calibri"/>
-          <w:sz w:val="22"/>
-          <w:szCs w:val="22"/>
-        </w:rPr>
-        <w:t xml:space="preserve"> </w:t>
-      </w:r>
-      <w:r>
-        <w:rPr>
-          <w:rFonts w:ascii="Calibri" w:hAnsi="Calibri" w:cs="Calibri"/>
-          <w:sz w:val="22"/>
-          <w:szCs w:val="22"/>
-        </w:rPr>
-        <w:t>con el resultado. Merge solo si no hay desvíos.</w:t>
+        <w:t xml:space="preserve"> con el resultado. Merge solo si no hay desvíos.</w:t>
       </w:r>
     </w:p>
     <w:p>
       <w:pPr>
         <w:pStyle w:val="NormalWeb"/>
-        <w:rPr>
-          <w:rFonts w:ascii="Calibri" w:hAnsi="Calibri" w:cs="Calibri"/>
-          <w:sz w:val="22"/>
-          <w:szCs w:val="22"/>
-        </w:rPr>
       </w:pPr>
       <w:r>
         <w:rPr>
           <w:rStyle w:val="Fuerte"/>
-          <w:rFonts w:ascii="Calibri" w:hAnsi="Calibri" w:cs="Calibri"/>
-          <w:sz w:val="22"/>
-          <w:szCs w:val="22"/>
         </w:rPr>
         <w:t>6. Merge + Claude archiva</w:t>
       </w:r>
       <w:r>
-        <w:rPr>
-          <w:rFonts w:ascii="Calibri" w:hAnsi="Calibri" w:cs="Calibri"/>
-          <w:sz w:val="22"/>
-          <w:szCs w:val="22"/>
-        </w:rPr>
         <w:t xml:space="preserve"> (</w:t>
       </w:r>
       <w:r>
@@ -1611,29 +1237,14 @@
         <w:t>/opsx:archive</w:t>
       </w:r>
       <w:r>
-        <w:rPr>
-          <w:rFonts w:ascii="Calibri" w:hAnsi="Calibri" w:cs="Calibri"/>
-          <w:sz w:val="22"/>
-          <w:szCs w:val="22"/>
-        </w:rPr>
         <w:t>)</w:t>
       </w:r>
     </w:p>
     <w:p>
       <w:pPr>
         <w:pStyle w:val="NormalWeb"/>
-        <w:rPr>
-          <w:rFonts w:ascii="Calibri" w:hAnsi="Calibri" w:cs="Calibri"/>
-          <w:sz w:val="22"/>
-          <w:szCs w:val="22"/>
-        </w:rPr>
-      </w:pPr>
-      <w:r>
-        <w:rPr>
-          <w:rFonts w:ascii="Calibri" w:hAnsi="Calibri" w:cs="Calibri"/>
-          <w:sz w:val="22"/>
-          <w:szCs w:val="22"/>
-        </w:rPr>
+      </w:pPr>
+      <w:r>
         <w:t xml:space="preserve">Merge a </w:t>
       </w:r>
       <w:r>
@@ -1643,11 +1254,6 @@
         <w:t>main</w:t>
       </w:r>
       <w:r>
-        <w:rPr>
-          <w:rFonts w:ascii="Calibri" w:hAnsi="Calibri" w:cs="Calibri"/>
-          <w:sz w:val="22"/>
-          <w:szCs w:val="22"/>
-        </w:rPr>
         <w:t xml:space="preserve"> con verify aprobado. Claude archiva el change y escribe la nota final en Obsidian:</w:t>
       </w:r>
     </w:p>
@@ -1668,18 +1274,14 @@
     <w:p>
       <w:pPr>
         <w:rPr>
-          <w:rFonts w:ascii="Calibri" w:eastAsia="Times New Roman" w:hAnsi="Calibri" w:cs="Calibri"/>
-          <w:sz w:val="22"/>
-          <w:szCs w:val="22"/>
-        </w:rPr>
-      </w:pPr>
-      <w:r>
-        <w:rPr>
-          <w:rFonts w:ascii="Calibri" w:eastAsia="Times New Roman" w:hAnsi="Calibri" w:cs="Calibri"/>
-          <w:sz w:val="22"/>
-          <w:szCs w:val="22"/>
-        </w:rPr>
-        <w:pict w14:anchorId="1C07BF14">
+          <w:rFonts w:eastAsia="Times New Roman"/>
+        </w:rPr>
+      </w:pPr>
+      <w:r>
+        <w:rPr>
+          <w:rFonts w:eastAsia="Times New Roman"/>
+        </w:rPr>
+        <w:pict w14:anchorId="6124DF91">
           <v:rect id="_x0000_i1027" style="width:0;height:1.5pt" o:hralign="center" o:hrstd="t" o:hr="t" fillcolor="#a0a0a0" stroked="f"/>
         </w:pict>
       </w:r>
@@ -1688,12 +1290,12 @@
       <w:pPr>
         <w:pStyle w:val="Ttulo2"/>
         <w:rPr>
-          <w:rFonts w:ascii="Calibri" w:eastAsia="Times New Roman" w:hAnsi="Calibri" w:cs="Calibri"/>
-        </w:rPr>
-      </w:pPr>
-      <w:r>
-        <w:rPr>
-          <w:rFonts w:ascii="Calibri" w:eastAsia="Times New Roman" w:hAnsi="Calibri" w:cs="Calibri"/>
+          <w:rFonts w:eastAsia="Times New Roman"/>
+        </w:rPr>
+      </w:pPr>
+      <w:r>
+        <w:rPr>
+          <w:rFonts w:eastAsia="Times New Roman"/>
         </w:rPr>
         <w:t>Lo que cambia respecto a antes</w:t>
       </w:r>
@@ -1706,16 +1308,12 @@
         </w:numPr>
         <w:spacing w:before="100" w:beforeAutospacing="1" w:after="100" w:afterAutospacing="1"/>
         <w:rPr>
-          <w:rFonts w:ascii="Calibri" w:eastAsia="Times New Roman" w:hAnsi="Calibri" w:cs="Calibri"/>
-          <w:sz w:val="22"/>
-          <w:szCs w:val="22"/>
-        </w:rPr>
-      </w:pPr>
-      <w:r>
-        <w:rPr>
-          <w:rFonts w:ascii="Calibri" w:eastAsia="Times New Roman" w:hAnsi="Calibri" w:cs="Calibri"/>
-          <w:sz w:val="22"/>
-          <w:szCs w:val="22"/>
+          <w:rFonts w:eastAsia="Times New Roman"/>
+        </w:rPr>
+      </w:pPr>
+      <w:r>
+        <w:rPr>
+          <w:rFonts w:eastAsia="Times New Roman"/>
         </w:rPr>
         <w:t>Ningún change sin issue aprobado primero</w:t>
       </w:r>
@@ -1728,16 +1326,12 @@
         </w:numPr>
         <w:spacing w:before="100" w:beforeAutospacing="1" w:after="100" w:afterAutospacing="1"/>
         <w:rPr>
-          <w:rFonts w:ascii="Calibri" w:eastAsia="Times New Roman" w:hAnsi="Calibri" w:cs="Calibri"/>
-          <w:sz w:val="22"/>
-          <w:szCs w:val="22"/>
-        </w:rPr>
-      </w:pPr>
-      <w:r>
-        <w:rPr>
-          <w:rFonts w:ascii="Calibri" w:eastAsia="Times New Roman" w:hAnsi="Calibri" w:cs="Calibri"/>
-          <w:sz w:val="22"/>
-          <w:szCs w:val="22"/>
+          <w:rFonts w:eastAsia="Times New Roman"/>
+        </w:rPr>
+      </w:pPr>
+      <w:r>
+        <w:rPr>
+          <w:rFonts w:eastAsia="Times New Roman"/>
         </w:rPr>
         <w:t>Nada se implementa sin spec previa</w:t>
       </w:r>
@@ -1750,16 +1344,12 @@
         </w:numPr>
         <w:spacing w:before="100" w:beforeAutospacing="1" w:after="100" w:afterAutospacing="1"/>
         <w:rPr>
-          <w:rFonts w:ascii="Calibri" w:eastAsia="Times New Roman" w:hAnsi="Calibri" w:cs="Calibri"/>
-          <w:sz w:val="22"/>
-          <w:szCs w:val="22"/>
-        </w:rPr>
-      </w:pPr>
-      <w:r>
-        <w:rPr>
-          <w:rFonts w:ascii="Calibri" w:eastAsia="Times New Roman" w:hAnsi="Calibri" w:cs="Calibri"/>
-          <w:sz w:val="22"/>
-          <w:szCs w:val="22"/>
+          <w:rFonts w:eastAsia="Times New Roman"/>
+        </w:rPr>
+      </w:pPr>
+      <w:r>
+        <w:rPr>
+          <w:rFonts w:eastAsia="Times New Roman"/>
         </w:rPr>
         <w:t>Claude nunca escribe código — solo artefactos y notas en Obsidian</w:t>
       </w:r>
@@ -1772,18 +1362,14 @@
         </w:numPr>
         <w:spacing w:before="100" w:beforeAutospacing="1" w:after="100" w:afterAutospacing="1"/>
         <w:rPr>
-          <w:rFonts w:ascii="Calibri" w:eastAsia="Times New Roman" w:hAnsi="Calibri" w:cs="Calibri"/>
-          <w:sz w:val="22"/>
-          <w:szCs w:val="22"/>
-        </w:rPr>
-      </w:pPr>
-      <w:r>
-        <w:rPr>
-          <w:rFonts w:ascii="Calibri" w:eastAsia="Times New Roman" w:hAnsi="Calibri" w:cs="Calibri"/>
-          <w:sz w:val="22"/>
-          <w:szCs w:val="22"/>
-        </w:rPr>
-        <w:t>Copilot nunca planifica — solo ejecuta lo que dicen los artefactos</w:t>
+          <w:rFonts w:eastAsia="Times New Roman"/>
+        </w:rPr>
+      </w:pPr>
+      <w:r>
+        <w:rPr>
+          <w:rFonts w:eastAsia="Times New Roman"/>
+        </w:rPr>
+        <w:t>El Agente nunca planifica — solo ejecuta lo que dicen los artefactos</w:t>
       </w:r>
     </w:p>
     <w:p>
@@ -1794,16 +1380,12 @@
         </w:numPr>
         <w:spacing w:before="100" w:beforeAutospacing="1" w:after="100" w:afterAutospacing="1"/>
         <w:rPr>
-          <w:rFonts w:ascii="Calibri" w:eastAsia="Times New Roman" w:hAnsi="Calibri" w:cs="Calibri"/>
-          <w:sz w:val="22"/>
-          <w:szCs w:val="22"/>
-        </w:rPr>
-      </w:pPr>
-      <w:r>
-        <w:rPr>
-          <w:rFonts w:ascii="Calibri" w:eastAsia="Times New Roman" w:hAnsi="Calibri" w:cs="Calibri"/>
-          <w:sz w:val="22"/>
-          <w:szCs w:val="22"/>
+          <w:rFonts w:eastAsia="Times New Roman"/>
+        </w:rPr>
+      </w:pPr>
+      <w:r>
+        <w:rPr>
+          <w:rFonts w:eastAsia="Times New Roman"/>
         </w:rPr>
         <w:t xml:space="preserve">Cada change vive en su propio branch </w:t>
       </w:r>
@@ -1815,9 +1397,7 @@
       </w:r>
       <w:r>
         <w:rPr>
-          <w:rFonts w:ascii="Calibri" w:eastAsia="Times New Roman" w:hAnsi="Calibri" w:cs="Calibri"/>
-          <w:sz w:val="22"/>
-          <w:szCs w:val="22"/>
+          <w:rFonts w:eastAsia="Times New Roman"/>
         </w:rPr>
         <w:t xml:space="preserve"> y tiene PR</w:t>
       </w:r>
@@ -1830,16 +1410,12 @@
         </w:numPr>
         <w:spacing w:before="100" w:beforeAutospacing="1" w:after="100" w:afterAutospacing="1"/>
         <w:rPr>
-          <w:rFonts w:ascii="Calibri" w:eastAsia="Times New Roman" w:hAnsi="Calibri" w:cs="Calibri"/>
-          <w:sz w:val="22"/>
-          <w:szCs w:val="22"/>
-        </w:rPr>
-      </w:pPr>
-      <w:r>
-        <w:rPr>
-          <w:rFonts w:ascii="Calibri" w:eastAsia="Times New Roman" w:hAnsi="Calibri" w:cs="Calibri"/>
-          <w:sz w:val="22"/>
-          <w:szCs w:val="22"/>
+          <w:rFonts w:eastAsia="Times New Roman"/>
+        </w:rPr>
+      </w:pPr>
+      <w:r>
+        <w:rPr>
+          <w:rFonts w:eastAsia="Times New Roman"/>
         </w:rPr>
         <w:t>Merge a main solo con verify aprobado</w:t>
       </w:r>
@@ -1852,16 +1428,12 @@
         </w:numPr>
         <w:spacing w:before="100" w:beforeAutospacing="1" w:after="100" w:afterAutospacing="1"/>
         <w:rPr>
-          <w:rFonts w:ascii="Calibri" w:eastAsia="Times New Roman" w:hAnsi="Calibri" w:cs="Calibri"/>
-          <w:sz w:val="22"/>
-          <w:szCs w:val="22"/>
-        </w:rPr>
-      </w:pPr>
-      <w:r>
-        <w:rPr>
-          <w:rFonts w:ascii="Calibri" w:eastAsia="Times New Roman" w:hAnsi="Calibri" w:cs="Calibri"/>
-          <w:sz w:val="22"/>
-          <w:szCs w:val="22"/>
+          <w:rFonts w:eastAsia="Times New Roman"/>
+        </w:rPr>
+      </w:pPr>
+      <w:r>
+        <w:rPr>
+          <w:rFonts w:eastAsia="Times New Roman"/>
         </w:rPr>
         <w:t>Cada change queda trazado en git (</w:t>
       </w:r>
@@ -1873,9 +1445,7 @@
       </w:r>
       <w:r>
         <w:rPr>
-          <w:rFonts w:ascii="Calibri" w:eastAsia="Times New Roman" w:hAnsi="Calibri" w:cs="Calibri"/>
-          <w:sz w:val="22"/>
-          <w:szCs w:val="22"/>
+          <w:rFonts w:eastAsia="Times New Roman"/>
         </w:rPr>
         <w:t>) y en Obsidian (</w:t>
       </w:r>
@@ -1887,11 +1457,21 @@
       </w:r>
       <w:r>
         <w:rPr>
-          <w:rFonts w:ascii="Calibri" w:eastAsia="Times New Roman" w:hAnsi="Calibri" w:cs="Calibri"/>
-          <w:sz w:val="22"/>
-          <w:szCs w:val="22"/>
-        </w:rPr>
-        <w:t xml:space="preserve"> → </w:t>
+          <w:rFonts w:eastAsia="Times New Roman"/>
+        </w:rPr>
+        <w:t xml:space="preserve"> </w:t>
+      </w:r>
+      <w:r>
+        <w:rPr>
+          <w:rFonts w:eastAsia="Times New Roman"/>
+        </w:rPr>
+        <w:t>→</w:t>
+      </w:r>
+      <w:r>
+        <w:rPr>
+          <w:rFonts w:eastAsia="Times New Roman"/>
+        </w:rPr>
+        <w:t xml:space="preserve"> </w:t>
       </w:r>
       <w:r>
         <w:rPr>
@@ -1901,9 +1481,7 @@
       </w:r>
       <w:r>
         <w:rPr>
-          <w:rFonts w:ascii="Calibri" w:eastAsia="Times New Roman" w:hAnsi="Calibri" w:cs="Calibri"/>
-          <w:sz w:val="22"/>
-          <w:szCs w:val="22"/>
+          <w:rFonts w:eastAsia="Times New Roman"/>
         </w:rPr>
         <w:t>)</w:t>
       </w:r>
@@ -1911,18 +1489,14 @@
     <w:p>
       <w:pPr>
         <w:rPr>
-          <w:rFonts w:ascii="Calibri" w:eastAsia="Times New Roman" w:hAnsi="Calibri" w:cs="Calibri"/>
-          <w:sz w:val="22"/>
-          <w:szCs w:val="22"/>
-        </w:rPr>
-      </w:pPr>
-      <w:r>
-        <w:rPr>
-          <w:rFonts w:ascii="Calibri" w:eastAsia="Times New Roman" w:hAnsi="Calibri" w:cs="Calibri"/>
-          <w:sz w:val="22"/>
-          <w:szCs w:val="22"/>
-        </w:rPr>
-        <w:pict w14:anchorId="703A1344">
+          <w:rFonts w:eastAsia="Times New Roman"/>
+        </w:rPr>
+      </w:pPr>
+      <w:r>
+        <w:rPr>
+          <w:rFonts w:eastAsia="Times New Roman"/>
+        </w:rPr>
+        <w:pict w14:anchorId="5EA1A680">
           <v:rect id="_x0000_i1028" style="width:0;height:1.5pt" o:hralign="center" o:hrstd="t" o:hr="t" fillcolor="#a0a0a0" stroked="f"/>
         </w:pict>
       </w:r>
@@ -1931,12 +1505,12 @@
       <w:pPr>
         <w:pStyle w:val="Ttulo2"/>
         <w:rPr>
-          <w:rFonts w:ascii="Calibri" w:eastAsia="Times New Roman" w:hAnsi="Calibri" w:cs="Calibri"/>
-        </w:rPr>
-      </w:pPr>
-      <w:r>
-        <w:rPr>
-          <w:rFonts w:ascii="Calibri" w:eastAsia="Times New Roman" w:hAnsi="Calibri" w:cs="Calibri"/>
+          <w:rFonts w:eastAsia="Times New Roman"/>
+        </w:rPr>
+      </w:pPr>
+      <w:r>
+        <w:rPr>
+          <w:rFonts w:eastAsia="Times New Roman"/>
         </w:rPr>
         <w:t>Reglas de Git</w:t>
       </w:r>
@@ -1945,12 +1519,12 @@
       <w:pPr>
         <w:pStyle w:val="Ttulo3"/>
         <w:rPr>
-          <w:rFonts w:ascii="Calibri" w:eastAsia="Times New Roman" w:hAnsi="Calibri" w:cs="Calibri"/>
-        </w:rPr>
-      </w:pPr>
-      <w:r>
-        <w:rPr>
-          <w:rFonts w:ascii="Calibri" w:eastAsia="Times New Roman" w:hAnsi="Calibri" w:cs="Calibri"/>
+          <w:rFonts w:eastAsia="Times New Roman"/>
+        </w:rPr>
+      </w:pPr>
+      <w:r>
+        <w:rPr>
+          <w:rFonts w:eastAsia="Times New Roman"/>
         </w:rPr>
         <w:t>Branches</w:t>
       </w:r>
@@ -1963,9 +1537,7 @@
         </w:numPr>
         <w:spacing w:before="100" w:beforeAutospacing="1" w:after="100" w:afterAutospacing="1"/>
         <w:rPr>
-          <w:rFonts w:ascii="Calibri" w:eastAsia="Times New Roman" w:hAnsi="Calibri" w:cs="Calibri"/>
-          <w:sz w:val="22"/>
-          <w:szCs w:val="22"/>
+          <w:rFonts w:eastAsia="Times New Roman"/>
         </w:rPr>
       </w:pPr>
       <w:r>
@@ -1976,9 +1548,7 @@
       </w:r>
       <w:r>
         <w:rPr>
-          <w:rFonts w:ascii="Calibri" w:eastAsia="Times New Roman" w:hAnsi="Calibri" w:cs="Calibri"/>
-          <w:sz w:val="22"/>
-          <w:szCs w:val="22"/>
+          <w:rFonts w:eastAsia="Times New Roman"/>
         </w:rPr>
         <w:t xml:space="preserve"> — una rama por change, creada por Claude al finalizar propose</w:t>
       </w:r>
@@ -1991,16 +1561,12 @@
         </w:numPr>
         <w:spacing w:before="100" w:beforeAutospacing="1" w:after="100" w:afterAutospacing="1"/>
         <w:rPr>
-          <w:rFonts w:ascii="Calibri" w:eastAsia="Times New Roman" w:hAnsi="Calibri" w:cs="Calibri"/>
-          <w:sz w:val="22"/>
-          <w:szCs w:val="22"/>
-        </w:rPr>
-      </w:pPr>
-      <w:r>
-        <w:rPr>
-          <w:rFonts w:ascii="Calibri" w:eastAsia="Times New Roman" w:hAnsi="Calibri" w:cs="Calibri"/>
-          <w:sz w:val="22"/>
-          <w:szCs w:val="22"/>
+          <w:rFonts w:eastAsia="Times New Roman"/>
+        </w:rPr>
+      </w:pPr>
+      <w:r>
+        <w:rPr>
+          <w:rFonts w:eastAsia="Times New Roman"/>
         </w:rPr>
         <w:t xml:space="preserve">Nunca commitear directo en </w:t>
       </w:r>
@@ -2012,9 +1578,7 @@
       </w:r>
       <w:r>
         <w:rPr>
-          <w:rFonts w:ascii="Calibri" w:eastAsia="Times New Roman" w:hAnsi="Calibri" w:cs="Calibri"/>
-          <w:sz w:val="22"/>
-          <w:szCs w:val="22"/>
+          <w:rFonts w:eastAsia="Times New Roman"/>
         </w:rPr>
         <w:t>/</w:t>
       </w:r>
@@ -2029,12 +1593,12 @@
       <w:pPr>
         <w:pStyle w:val="Ttulo3"/>
         <w:rPr>
-          <w:rFonts w:ascii="Calibri" w:eastAsia="Times New Roman" w:hAnsi="Calibri" w:cs="Calibri"/>
-        </w:rPr>
-      </w:pPr>
-      <w:r>
-        <w:rPr>
-          <w:rFonts w:ascii="Calibri" w:eastAsia="Times New Roman" w:hAnsi="Calibri" w:cs="Calibri"/>
+          <w:rFonts w:eastAsia="Times New Roman"/>
+        </w:rPr>
+      </w:pPr>
+      <w:r>
+        <w:rPr>
+          <w:rFonts w:eastAsia="Times New Roman"/>
         </w:rPr>
         <w:t>Commits</w:t>
       </w:r>
@@ -2047,16 +1611,12 @@
         </w:numPr>
         <w:spacing w:before="100" w:beforeAutospacing="1" w:after="100" w:afterAutospacing="1"/>
         <w:rPr>
-          <w:rFonts w:ascii="Calibri" w:eastAsia="Times New Roman" w:hAnsi="Calibri" w:cs="Calibri"/>
-          <w:sz w:val="22"/>
-          <w:szCs w:val="22"/>
-        </w:rPr>
-      </w:pPr>
-      <w:r>
-        <w:rPr>
-          <w:rFonts w:ascii="Calibri" w:eastAsia="Times New Roman" w:hAnsi="Calibri" w:cs="Calibri"/>
-          <w:sz w:val="22"/>
-          <w:szCs w:val="22"/>
+          <w:rFonts w:eastAsia="Times New Roman"/>
+        </w:rPr>
+      </w:pPr>
+      <w:r>
+        <w:rPr>
+          <w:rFonts w:eastAsia="Times New Roman"/>
         </w:rPr>
         <w:t xml:space="preserve">Formato: </w:t>
       </w:r>
@@ -2068,9 +1628,7 @@
       </w:r>
       <w:r>
         <w:rPr>
-          <w:rFonts w:ascii="Calibri" w:eastAsia="Times New Roman" w:hAnsi="Calibri" w:cs="Calibri"/>
-          <w:sz w:val="22"/>
-          <w:szCs w:val="22"/>
+          <w:rFonts w:eastAsia="Times New Roman"/>
         </w:rPr>
         <w:t xml:space="preserve"> — types: </w:t>
       </w:r>
@@ -2082,9 +1640,7 @@
       </w:r>
       <w:r>
         <w:rPr>
-          <w:rFonts w:ascii="Calibri" w:eastAsia="Times New Roman" w:hAnsi="Calibri" w:cs="Calibri"/>
-          <w:sz w:val="22"/>
-          <w:szCs w:val="22"/>
+          <w:rFonts w:eastAsia="Times New Roman"/>
         </w:rPr>
         <w:t xml:space="preserve"> </w:t>
       </w:r>
@@ -2096,9 +1652,7 @@
       </w:r>
       <w:r>
         <w:rPr>
-          <w:rFonts w:ascii="Calibri" w:eastAsia="Times New Roman" w:hAnsi="Calibri" w:cs="Calibri"/>
-          <w:sz w:val="22"/>
-          <w:szCs w:val="22"/>
+          <w:rFonts w:eastAsia="Times New Roman"/>
         </w:rPr>
         <w:t xml:space="preserve"> </w:t>
       </w:r>
@@ -2110,9 +1664,7 @@
       </w:r>
       <w:r>
         <w:rPr>
-          <w:rFonts w:ascii="Calibri" w:eastAsia="Times New Roman" w:hAnsi="Calibri" w:cs="Calibri"/>
-          <w:sz w:val="22"/>
-          <w:szCs w:val="22"/>
+          <w:rFonts w:eastAsia="Times New Roman"/>
         </w:rPr>
         <w:t xml:space="preserve"> </w:t>
       </w:r>
@@ -2124,9 +1676,7 @@
       </w:r>
       <w:r>
         <w:rPr>
-          <w:rFonts w:ascii="Calibri" w:eastAsia="Times New Roman" w:hAnsi="Calibri" w:cs="Calibri"/>
-          <w:sz w:val="22"/>
-          <w:szCs w:val="22"/>
+          <w:rFonts w:eastAsia="Times New Roman"/>
         </w:rPr>
         <w:t xml:space="preserve"> </w:t>
       </w:r>
@@ -2138,9 +1688,7 @@
       </w:r>
       <w:r>
         <w:rPr>
-          <w:rFonts w:ascii="Calibri" w:eastAsia="Times New Roman" w:hAnsi="Calibri" w:cs="Calibri"/>
-          <w:sz w:val="22"/>
-          <w:szCs w:val="22"/>
+          <w:rFonts w:eastAsia="Times New Roman"/>
         </w:rPr>
         <w:t xml:space="preserve"> </w:t>
       </w:r>
@@ -2159,16 +1707,12 @@
         </w:numPr>
         <w:spacing w:before="100" w:beforeAutospacing="1" w:after="100" w:afterAutospacing="1"/>
         <w:rPr>
-          <w:rFonts w:ascii="Calibri" w:eastAsia="Times New Roman" w:hAnsi="Calibri" w:cs="Calibri"/>
-          <w:sz w:val="22"/>
-          <w:szCs w:val="22"/>
-        </w:rPr>
-      </w:pPr>
-      <w:r>
-        <w:rPr>
-          <w:rFonts w:ascii="Calibri" w:eastAsia="Times New Roman" w:hAnsi="Calibri" w:cs="Calibri"/>
-          <w:sz w:val="22"/>
-          <w:szCs w:val="22"/>
+          <w:rFonts w:eastAsia="Times New Roman"/>
+        </w:rPr>
+      </w:pPr>
+      <w:r>
+        <w:rPr>
+          <w:rFonts w:eastAsia="Times New Roman"/>
         </w:rPr>
         <w:t xml:space="preserve">Trailer obligatorio en todos los commits del change: </w:t>
       </w:r>
@@ -2183,12 +1727,12 @@
       <w:pPr>
         <w:pStyle w:val="Ttulo3"/>
         <w:rPr>
-          <w:rFonts w:ascii="Calibri" w:eastAsia="Times New Roman" w:hAnsi="Calibri" w:cs="Calibri"/>
-        </w:rPr>
-      </w:pPr>
-      <w:r>
-        <w:rPr>
-          <w:rFonts w:ascii="Calibri" w:eastAsia="Times New Roman" w:hAnsi="Calibri" w:cs="Calibri"/>
+          <w:rFonts w:eastAsia="Times New Roman"/>
+        </w:rPr>
+      </w:pPr>
+      <w:r>
+        <w:rPr>
+          <w:rFonts w:eastAsia="Times New Roman"/>
         </w:rPr>
         <w:t>.env y .gitignore</w:t>
       </w:r>
@@ -2201,9 +1745,7 @@
         </w:numPr>
         <w:spacing w:before="100" w:beforeAutospacing="1" w:after="100" w:afterAutospacing="1"/>
         <w:rPr>
-          <w:rFonts w:ascii="Calibri" w:eastAsia="Times New Roman" w:hAnsi="Calibri" w:cs="Calibri"/>
-          <w:sz w:val="22"/>
-          <w:szCs w:val="22"/>
+          <w:rFonts w:eastAsia="Times New Roman"/>
         </w:rPr>
       </w:pPr>
       <w:r>
@@ -2214,9 +1756,7 @@
       </w:r>
       <w:r>
         <w:rPr>
-          <w:rFonts w:ascii="Calibri" w:eastAsia="Times New Roman" w:hAnsi="Calibri" w:cs="Calibri"/>
-          <w:sz w:val="22"/>
-          <w:szCs w:val="22"/>
+          <w:rFonts w:eastAsia="Times New Roman"/>
         </w:rPr>
         <w:t xml:space="preserve"> mínimo obligatorio: </w:t>
       </w:r>
@@ -2228,9 +1768,7 @@
       </w:r>
       <w:r>
         <w:rPr>
-          <w:rFonts w:ascii="Calibri" w:eastAsia="Times New Roman" w:hAnsi="Calibri" w:cs="Calibri"/>
-          <w:sz w:val="22"/>
-          <w:szCs w:val="22"/>
+          <w:rFonts w:eastAsia="Times New Roman"/>
         </w:rPr>
         <w:t xml:space="preserve">, </w:t>
       </w:r>
@@ -2242,9 +1780,7 @@
       </w:r>
       <w:r>
         <w:rPr>
-          <w:rFonts w:ascii="Calibri" w:eastAsia="Times New Roman" w:hAnsi="Calibri" w:cs="Calibri"/>
-          <w:sz w:val="22"/>
-          <w:szCs w:val="22"/>
+          <w:rFonts w:eastAsia="Times New Roman"/>
         </w:rPr>
         <w:t xml:space="preserve">, </w:t>
       </w:r>
@@ -2256,9 +1792,7 @@
       </w:r>
       <w:r>
         <w:rPr>
-          <w:rFonts w:ascii="Calibri" w:eastAsia="Times New Roman" w:hAnsi="Calibri" w:cs="Calibri"/>
-          <w:sz w:val="22"/>
-          <w:szCs w:val="22"/>
+          <w:rFonts w:eastAsia="Times New Roman"/>
         </w:rPr>
         <w:t xml:space="preserve">, </w:t>
       </w:r>
@@ -2270,9 +1804,7 @@
       </w:r>
       <w:r>
         <w:rPr>
-          <w:rFonts w:ascii="Calibri" w:eastAsia="Times New Roman" w:hAnsi="Calibri" w:cs="Calibri"/>
-          <w:sz w:val="22"/>
-          <w:szCs w:val="22"/>
+          <w:rFonts w:eastAsia="Times New Roman"/>
         </w:rPr>
         <w:t xml:space="preserve">, </w:t>
       </w:r>
@@ -2291,16 +1823,12 @@
         </w:numPr>
         <w:spacing w:before="100" w:beforeAutospacing="1" w:after="100" w:afterAutospacing="1"/>
         <w:rPr>
-          <w:rFonts w:ascii="Calibri" w:eastAsia="Times New Roman" w:hAnsi="Calibri" w:cs="Calibri"/>
-          <w:sz w:val="22"/>
-          <w:szCs w:val="22"/>
-        </w:rPr>
-      </w:pPr>
-      <w:r>
-        <w:rPr>
-          <w:rFonts w:ascii="Calibri" w:eastAsia="Times New Roman" w:hAnsi="Calibri" w:cs="Calibri"/>
-          <w:sz w:val="22"/>
-          <w:szCs w:val="22"/>
+          <w:rFonts w:eastAsia="Times New Roman"/>
+        </w:rPr>
+      </w:pPr>
+      <w:r>
+        <w:rPr>
+          <w:rFonts w:eastAsia="Times New Roman"/>
         </w:rPr>
         <w:t xml:space="preserve">Verificar que </w:t>
       </w:r>
@@ -2312,9 +1840,7 @@
       </w:r>
       <w:r>
         <w:rPr>
-          <w:rFonts w:ascii="Calibri" w:eastAsia="Times New Roman" w:hAnsi="Calibri" w:cs="Calibri"/>
-          <w:sz w:val="22"/>
-          <w:szCs w:val="22"/>
+          <w:rFonts w:eastAsia="Times New Roman"/>
         </w:rPr>
         <w:t xml:space="preserve"> está en </w:t>
       </w:r>
@@ -2326,9 +1852,7 @@
       </w:r>
       <w:r>
         <w:rPr>
-          <w:rFonts w:ascii="Calibri" w:eastAsia="Times New Roman" w:hAnsi="Calibri" w:cs="Calibri"/>
-          <w:sz w:val="22"/>
-          <w:szCs w:val="22"/>
+          <w:rFonts w:eastAsia="Times New Roman"/>
         </w:rPr>
         <w:t xml:space="preserve"> antes de cada push</w:t>
       </w:r>
@@ -2341,16 +1865,12 @@
         </w:numPr>
         <w:spacing w:before="100" w:beforeAutospacing="1" w:after="100" w:afterAutospacing="1"/>
         <w:rPr>
-          <w:rFonts w:ascii="Calibri" w:eastAsia="Times New Roman" w:hAnsi="Calibri" w:cs="Calibri"/>
-          <w:sz w:val="22"/>
-          <w:szCs w:val="22"/>
-        </w:rPr>
-      </w:pPr>
-      <w:r>
-        <w:rPr>
-          <w:rFonts w:ascii="Calibri" w:eastAsia="Times New Roman" w:hAnsi="Calibri" w:cs="Calibri"/>
-          <w:sz w:val="22"/>
-          <w:szCs w:val="22"/>
+          <w:rFonts w:eastAsia="Times New Roman"/>
+        </w:rPr>
+      </w:pPr>
+      <w:r>
+        <w:rPr>
+          <w:rFonts w:eastAsia="Times New Roman"/>
         </w:rPr>
         <w:t>Nunca commitear credenciales, tokens ni API keys</w:t>
       </w:r>
@@ -2358,18 +1878,14 @@
     <w:p>
       <w:pPr>
         <w:rPr>
-          <w:rFonts w:ascii="Calibri" w:eastAsia="Times New Roman" w:hAnsi="Calibri" w:cs="Calibri"/>
-          <w:sz w:val="22"/>
-          <w:szCs w:val="22"/>
-        </w:rPr>
-      </w:pPr>
-      <w:r>
-        <w:rPr>
-          <w:rFonts w:ascii="Calibri" w:eastAsia="Times New Roman" w:hAnsi="Calibri" w:cs="Calibri"/>
-          <w:sz w:val="22"/>
-          <w:szCs w:val="22"/>
-        </w:rPr>
-        <w:pict w14:anchorId="7F020FF6">
+          <w:rFonts w:eastAsia="Times New Roman"/>
+        </w:rPr>
+      </w:pPr>
+      <w:r>
+        <w:rPr>
+          <w:rFonts w:eastAsia="Times New Roman"/>
+        </w:rPr>
+        <w:pict w14:anchorId="7A7D5AC2">
           <v:rect id="_x0000_i1029" style="width:0;height:1.5pt" o:hralign="center" o:hrstd="t" o:hr="t" fillcolor="#a0a0a0" stroked="f"/>
         </w:pict>
       </w:r>
@@ -2378,12 +1894,12 @@
       <w:pPr>
         <w:pStyle w:val="Ttulo2"/>
         <w:rPr>
-          <w:rFonts w:ascii="Calibri" w:eastAsia="Times New Roman" w:hAnsi="Calibri" w:cs="Calibri"/>
-        </w:rPr>
-      </w:pPr>
-      <w:r>
-        <w:rPr>
-          <w:rFonts w:ascii="Calibri" w:eastAsia="Times New Roman" w:hAnsi="Calibri" w:cs="Calibri"/>
+          <w:rFonts w:eastAsia="Times New Roman"/>
+        </w:rPr>
+      </w:pPr>
+      <w:r>
+        <w:rPr>
+          <w:rFonts w:eastAsia="Times New Roman"/>
         </w:rPr>
         <w:t>Capa de Persistencia — Obsidian</w:t>
       </w:r>
@@ -2391,18 +1907,8 @@
     <w:p>
       <w:pPr>
         <w:pStyle w:val="NormalWeb"/>
-        <w:rPr>
-          <w:rFonts w:ascii="Calibri" w:hAnsi="Calibri" w:cs="Calibri"/>
-          <w:sz w:val="22"/>
-          <w:szCs w:val="22"/>
-        </w:rPr>
-      </w:pPr>
-      <w:r>
-        <w:rPr>
-          <w:rFonts w:ascii="Calibri" w:hAnsi="Calibri" w:cs="Calibri"/>
-          <w:sz w:val="22"/>
-          <w:szCs w:val="22"/>
-        </w:rPr>
+      </w:pPr>
+      <w:r>
         <w:t xml:space="preserve">El vault en </w:t>
       </w:r>
       <w:r>
@@ -2412,24 +1918,22 @@
         <w:t>$env:OBSIDIAN_VAULT</w:t>
       </w:r>
       <w:r>
-        <w:rPr>
-          <w:rFonts w:ascii="Calibri" w:hAnsi="Calibri" w:cs="Calibri"/>
-          <w:sz w:val="22"/>
-          <w:szCs w:val="22"/>
-        </w:rPr>
-        <w:t xml:space="preserve"> actúa como memoria persistente del proyecto — equivalente a Engram pero sobre el filesystem local. Claude lee y escribe automáticamente en cada operación OPSX, sin MCP ni plugins.</w:t>
+        <w:t xml:space="preserve"> </w:t>
+      </w:r>
+      <w:r>
+        <w:t>actúa como memoria persistente del proyecto — equivalente a Engram pero sobre el filesystem local. Claude lee y escribe automáticamente en cada operación OPSX, sin MCP ni plugins.</w:t>
       </w:r>
     </w:p>
     <w:p>
       <w:pPr>
         <w:pStyle w:val="Ttulo3"/>
         <w:rPr>
-          <w:rFonts w:ascii="Calibri" w:eastAsia="Times New Roman" w:hAnsi="Calibri" w:cs="Calibri"/>
-        </w:rPr>
-      </w:pPr>
-      <w:r>
-        <w:rPr>
-          <w:rFonts w:ascii="Calibri" w:eastAsia="Times New Roman" w:hAnsi="Calibri" w:cs="Calibri"/>
+          <w:rFonts w:eastAsia="Times New Roman"/>
+        </w:rPr>
+      </w:pPr>
+      <w:r>
+        <w:rPr>
+          <w:rFonts w:eastAsia="Times New Roman"/>
         </w:rPr>
         <w:t>Estructura del vault</w:t>
       </w:r>
@@ -2479,7 +1983,7 @@
         <w:rPr>
           <w:rStyle w:val="CdigoHTML"/>
         </w:rPr>
-        <w:t>← espejo del CLAUDE.md global (lo leen Copilot y Gemini)</w:t>
+        <w:t>← espejo del CLAUDE.md global (lo lee el Agente)</w:t>
       </w:r>
     </w:p>
     <w:p>
@@ -2521,7 +2025,13 @@
         <w:rPr>
           <w:rStyle w:val="CdigoHTML"/>
         </w:rPr>
-        <w:t xml:space="preserve">      _index.md                     ← índice con links a todos los changes</w:t>
+        <w:t xml:space="preserve">      _index.md                     </w:t>
+      </w:r>
+      <w:r>
+        <w:rPr>
+          <w:rStyle w:val="CdigoHTML"/>
+        </w:rPr>
+        <w:t>← índice con links a todos los changes</w:t>
       </w:r>
     </w:p>
     <w:p>
@@ -2535,7 +2045,13 @@
         <w:rPr>
           <w:rStyle w:val="CdigoHTML"/>
         </w:rPr>
-        <w:t xml:space="preserve">      context.md                    ← estado actual del proyecto (actualizado continuamente)</w:t>
+        <w:t xml:space="preserve">      context.md                    </w:t>
+      </w:r>
+      <w:r>
+        <w:rPr>
+          <w:rStyle w:val="CdigoHTML"/>
+        </w:rPr>
+        <w:t>← estado actual del proyecto (actualizado continuamente)</w:t>
       </w:r>
     </w:p>
     <w:p>
@@ -2563,7 +2079,13 @@
         <w:rPr>
           <w:rStyle w:val="CdigoHTML"/>
         </w:rPr>
-        <w:t xml:space="preserve">        YYYY-MM-DD-{change}.md      ← creada al propose</w:t>
+        <w:t xml:space="preserve">        YYYY-MM-DD-{change}.md      </w:t>
+      </w:r>
+      <w:r>
+        <w:rPr>
+          <w:rStyle w:val="CdigoHTML"/>
+        </w:rPr>
+        <w:t>← creada al propose</w:t>
       </w:r>
     </w:p>
     <w:p>
@@ -2591,19 +2113,25 @@
         <w:rPr>
           <w:rStyle w:val="CdigoHTML"/>
         </w:rPr>
-        <w:t xml:space="preserve">        YYYY-MM-DD-{change}.md      ← creada al archive</w:t>
+        <w:t xml:space="preserve">        YYYY-MM-DD-{change}.md      </w:t>
+      </w:r>
+      <w:r>
+        <w:rPr>
+          <w:rStyle w:val="CdigoHTML"/>
+        </w:rPr>
+        <w:t>← creada al archive</w:t>
       </w:r>
     </w:p>
     <w:p>
       <w:pPr>
         <w:pStyle w:val="Ttulo3"/>
         <w:rPr>
-          <w:rFonts w:ascii="Calibri" w:eastAsia="Times New Roman" w:hAnsi="Calibri" w:cs="Calibri"/>
-        </w:rPr>
-      </w:pPr>
-      <w:r>
-        <w:rPr>
-          <w:rFonts w:ascii="Calibri" w:eastAsia="Times New Roman" w:hAnsi="Calibri" w:cs="Calibri"/>
+          <w:rFonts w:eastAsia="Times New Roman"/>
+        </w:rPr>
+      </w:pPr>
+      <w:r>
+        <w:rPr>
+          <w:rFonts w:eastAsia="Times New Roman"/>
         </w:rPr>
         <w:t>Cuándo actúa Claude</w:t>
       </w:r>
@@ -2611,6 +2139,7 @@
     <w:tbl>
       <w:tblPr>
         <w:tblW w:w="0" w:type="auto"/>
+        <w:tblCellSpacing w:w="15" w:type="dxa"/>
         <w:tblCellMar>
           <w:top w:w="15" w:type="dxa"/>
           <w:left w:w="15" w:type="dxa"/>
@@ -2620,29 +2149,18 @@
         <w:tblLook w:val="04A0" w:firstRow="1" w:lastRow="0" w:firstColumn="1" w:lastColumn="0" w:noHBand="0" w:noVBand="1"/>
       </w:tblPr>
       <w:tblGrid>
-        <w:gridCol w:w="1760"/>
-        <w:gridCol w:w="3193"/>
-        <w:gridCol w:w="3535"/>
+        <w:gridCol w:w="1728"/>
+        <w:gridCol w:w="3225"/>
+        <w:gridCol w:w="3551"/>
       </w:tblGrid>
       <w:tr>
         <w:trPr>
           <w:tblHeader/>
+          <w:tblCellSpacing w:w="15" w:type="dxa"/>
         </w:trPr>
         <w:tc>
           <w:tcPr>
             <w:tcW w:w="0" w:type="auto"/>
-            <w:tcBorders>
-              <w:top w:val="single" w:sz="6" w:space="0" w:color="999999"/>
-              <w:left w:val="single" w:sz="6" w:space="0" w:color="999999"/>
-              <w:bottom w:val="single" w:sz="6" w:space="0" w:color="999999"/>
-              <w:right w:val="single" w:sz="6" w:space="0" w:color="999999"/>
-            </w:tcBorders>
-            <w:tcMar>
-              <w:top w:w="60" w:type="dxa"/>
-              <w:left w:w="120" w:type="dxa"/>
-              <w:bottom w:w="60" w:type="dxa"/>
-              <w:right w:w="120" w:type="dxa"/>
-            </w:tcMar>
             <w:vAlign w:val="center"/>
             <w:hideMark/>
           </w:tcPr>
@@ -2650,20 +2168,16 @@
             <w:pPr>
               <w:jc w:val="center"/>
               <w:rPr>
-                <w:rFonts w:ascii="Calibri" w:eastAsia="Times New Roman" w:hAnsi="Calibri" w:cs="Calibri"/>
+                <w:rFonts w:eastAsia="Times New Roman"/>
                 <w:b/>
                 <w:bCs/>
-                <w:sz w:val="22"/>
-                <w:szCs w:val="22"/>
               </w:rPr>
             </w:pPr>
             <w:r>
               <w:rPr>
-                <w:rFonts w:ascii="Calibri" w:eastAsia="Times New Roman" w:hAnsi="Calibri" w:cs="Calibri"/>
+                <w:rFonts w:eastAsia="Times New Roman"/>
                 <w:b/>
                 <w:bCs/>
-                <w:sz w:val="22"/>
-                <w:szCs w:val="22"/>
               </w:rPr>
               <w:t>Comando</w:t>
             </w:r>
@@ -2672,18 +2186,6 @@
         <w:tc>
           <w:tcPr>
             <w:tcW w:w="0" w:type="auto"/>
-            <w:tcBorders>
-              <w:top w:val="single" w:sz="6" w:space="0" w:color="999999"/>
-              <w:left w:val="single" w:sz="6" w:space="0" w:color="999999"/>
-              <w:bottom w:val="single" w:sz="6" w:space="0" w:color="999999"/>
-              <w:right w:val="single" w:sz="6" w:space="0" w:color="999999"/>
-            </w:tcBorders>
-            <w:tcMar>
-              <w:top w:w="60" w:type="dxa"/>
-              <w:left w:w="120" w:type="dxa"/>
-              <w:bottom w:w="60" w:type="dxa"/>
-              <w:right w:w="120" w:type="dxa"/>
-            </w:tcMar>
             <w:vAlign w:val="center"/>
             <w:hideMark/>
           </w:tcPr>
@@ -2691,20 +2193,16 @@
             <w:pPr>
               <w:jc w:val="center"/>
               <w:rPr>
-                <w:rFonts w:ascii="Calibri" w:eastAsia="Times New Roman" w:hAnsi="Calibri" w:cs="Calibri"/>
+                <w:rFonts w:eastAsia="Times New Roman"/>
                 <w:b/>
                 <w:bCs/>
-                <w:sz w:val="22"/>
-                <w:szCs w:val="22"/>
               </w:rPr>
             </w:pPr>
             <w:r>
               <w:rPr>
-                <w:rFonts w:ascii="Calibri" w:eastAsia="Times New Roman" w:hAnsi="Calibri" w:cs="Calibri"/>
+                <w:rFonts w:eastAsia="Times New Roman"/>
                 <w:b/>
                 <w:bCs/>
-                <w:sz w:val="22"/>
-                <w:szCs w:val="22"/>
               </w:rPr>
               <w:t>Lee</w:t>
             </w:r>
@@ -2713,18 +2211,6 @@
         <w:tc>
           <w:tcPr>
             <w:tcW w:w="0" w:type="auto"/>
-            <w:tcBorders>
-              <w:top w:val="single" w:sz="6" w:space="0" w:color="999999"/>
-              <w:left w:val="single" w:sz="6" w:space="0" w:color="999999"/>
-              <w:bottom w:val="single" w:sz="6" w:space="0" w:color="999999"/>
-              <w:right w:val="single" w:sz="6" w:space="0" w:color="999999"/>
-            </w:tcBorders>
-            <w:tcMar>
-              <w:top w:w="60" w:type="dxa"/>
-              <w:left w:w="120" w:type="dxa"/>
-              <w:bottom w:w="60" w:type="dxa"/>
-              <w:right w:w="120" w:type="dxa"/>
-            </w:tcMar>
             <w:vAlign w:val="center"/>
             <w:hideMark/>
           </w:tcPr>
@@ -2732,20 +2218,16 @@
             <w:pPr>
               <w:jc w:val="center"/>
               <w:rPr>
-                <w:rFonts w:ascii="Calibri" w:eastAsia="Times New Roman" w:hAnsi="Calibri" w:cs="Calibri"/>
+                <w:rFonts w:eastAsia="Times New Roman"/>
                 <w:b/>
                 <w:bCs/>
-                <w:sz w:val="22"/>
-                <w:szCs w:val="22"/>
               </w:rPr>
             </w:pPr>
             <w:r>
               <w:rPr>
-                <w:rFonts w:ascii="Calibri" w:eastAsia="Times New Roman" w:hAnsi="Calibri" w:cs="Calibri"/>
+                <w:rFonts w:eastAsia="Times New Roman"/>
                 <w:b/>
                 <w:bCs/>
-                <w:sz w:val="22"/>
-                <w:szCs w:val="22"/>
               </w:rPr>
               <w:t>Escribe</w:t>
             </w:r>
@@ -2753,37 +2235,24 @@
         </w:tc>
       </w:tr>
       <w:tr>
+        <w:trPr>
+          <w:tblCellSpacing w:w="15" w:type="dxa"/>
+        </w:trPr>
         <w:tc>
           <w:tcPr>
             <w:tcW w:w="0" w:type="auto"/>
-            <w:tcBorders>
-              <w:top w:val="single" w:sz="6" w:space="0" w:color="999999"/>
-              <w:left w:val="single" w:sz="6" w:space="0" w:color="999999"/>
-              <w:bottom w:val="single" w:sz="6" w:space="0" w:color="999999"/>
-              <w:right w:val="single" w:sz="6" w:space="0" w:color="999999"/>
-            </w:tcBorders>
-            <w:tcMar>
-              <w:top w:w="60" w:type="dxa"/>
-              <w:left w:w="120" w:type="dxa"/>
-              <w:bottom w:w="60" w:type="dxa"/>
-              <w:right w:w="120" w:type="dxa"/>
-            </w:tcMar>
             <w:vAlign w:val="center"/>
             <w:hideMark/>
           </w:tcPr>
           <w:p>
             <w:pPr>
               <w:rPr>
-                <w:rFonts w:ascii="Calibri" w:eastAsia="Times New Roman" w:hAnsi="Calibri" w:cs="Calibri"/>
-                <w:sz w:val="22"/>
-                <w:szCs w:val="22"/>
+                <w:rFonts w:eastAsia="Times New Roman"/>
               </w:rPr>
             </w:pPr>
             <w:r>
               <w:rPr>
-                <w:rFonts w:ascii="Calibri" w:eastAsia="Times New Roman" w:hAnsi="Calibri" w:cs="Calibri"/>
-                <w:sz w:val="22"/>
-                <w:szCs w:val="22"/>
+                <w:rFonts w:eastAsia="Times New Roman"/>
               </w:rPr>
               <w:t>Inicio de sesión</w:t>
             </w:r>
@@ -2792,27 +2261,13 @@
         <w:tc>
           <w:tcPr>
             <w:tcW w:w="0" w:type="auto"/>
-            <w:tcBorders>
-              <w:top w:val="single" w:sz="6" w:space="0" w:color="999999"/>
-              <w:left w:val="single" w:sz="6" w:space="0" w:color="999999"/>
-              <w:bottom w:val="single" w:sz="6" w:space="0" w:color="999999"/>
-              <w:right w:val="single" w:sz="6" w:space="0" w:color="999999"/>
-            </w:tcBorders>
-            <w:tcMar>
-              <w:top w:w="60" w:type="dxa"/>
-              <w:left w:w="120" w:type="dxa"/>
-              <w:bottom w:w="60" w:type="dxa"/>
-              <w:right w:w="120" w:type="dxa"/>
-            </w:tcMar>
             <w:vAlign w:val="center"/>
             <w:hideMark/>
           </w:tcPr>
           <w:p>
             <w:pPr>
               <w:rPr>
-                <w:rFonts w:ascii="Calibri" w:eastAsia="Times New Roman" w:hAnsi="Calibri" w:cs="Calibri"/>
-                <w:sz w:val="22"/>
-                <w:szCs w:val="22"/>
+                <w:rFonts w:eastAsia="Times New Roman"/>
               </w:rPr>
             </w:pPr>
             <w:r>
@@ -2823,9 +2278,7 @@
             </w:r>
             <w:r>
               <w:rPr>
-                <w:rFonts w:ascii="Calibri" w:eastAsia="Times New Roman" w:hAnsi="Calibri" w:cs="Calibri"/>
-                <w:sz w:val="22"/>
-                <w:szCs w:val="22"/>
+                <w:rFonts w:eastAsia="Times New Roman"/>
               </w:rPr>
               <w:t xml:space="preserve"> + últimas 3 notas de </w:t>
             </w:r>
@@ -2840,34 +2293,18 @@
         <w:tc>
           <w:tcPr>
             <w:tcW w:w="0" w:type="auto"/>
-            <w:tcBorders>
-              <w:top w:val="single" w:sz="6" w:space="0" w:color="999999"/>
-              <w:left w:val="single" w:sz="6" w:space="0" w:color="999999"/>
-              <w:bottom w:val="single" w:sz="6" w:space="0" w:color="999999"/>
-              <w:right w:val="single" w:sz="6" w:space="0" w:color="999999"/>
-            </w:tcBorders>
-            <w:tcMar>
-              <w:top w:w="60" w:type="dxa"/>
-              <w:left w:w="120" w:type="dxa"/>
-              <w:bottom w:w="60" w:type="dxa"/>
-              <w:right w:w="120" w:type="dxa"/>
-            </w:tcMar>
             <w:vAlign w:val="center"/>
             <w:hideMark/>
           </w:tcPr>
           <w:p>
             <w:pPr>
               <w:rPr>
-                <w:rFonts w:ascii="Calibri" w:eastAsia="Times New Roman" w:hAnsi="Calibri" w:cs="Calibri"/>
-                <w:sz w:val="22"/>
-                <w:szCs w:val="22"/>
+                <w:rFonts w:eastAsia="Times New Roman"/>
               </w:rPr>
             </w:pPr>
             <w:r>
               <w:rPr>
-                <w:rFonts w:ascii="Calibri" w:eastAsia="Times New Roman" w:hAnsi="Calibri" w:cs="Calibri"/>
-                <w:sz w:val="22"/>
-                <w:szCs w:val="22"/>
+                <w:rFonts w:eastAsia="Times New Roman"/>
               </w:rPr>
               <w:t>—</w:t>
             </w:r>
@@ -2875,30 +2312,19 @@
         </w:tc>
       </w:tr>
       <w:tr>
+        <w:trPr>
+          <w:tblCellSpacing w:w="15" w:type="dxa"/>
+        </w:trPr>
         <w:tc>
           <w:tcPr>
             <w:tcW w:w="0" w:type="auto"/>
-            <w:tcBorders>
-              <w:top w:val="single" w:sz="6" w:space="0" w:color="999999"/>
-              <w:left w:val="single" w:sz="6" w:space="0" w:color="999999"/>
-              <w:bottom w:val="single" w:sz="6" w:space="0" w:color="999999"/>
-              <w:right w:val="single" w:sz="6" w:space="0" w:color="999999"/>
-            </w:tcBorders>
-            <w:tcMar>
-              <w:top w:w="60" w:type="dxa"/>
-              <w:left w:w="120" w:type="dxa"/>
-              <w:bottom w:w="60" w:type="dxa"/>
-              <w:right w:w="120" w:type="dxa"/>
-            </w:tcMar>
             <w:vAlign w:val="center"/>
             <w:hideMark/>
           </w:tcPr>
           <w:p>
             <w:pPr>
               <w:rPr>
-                <w:rFonts w:ascii="Calibri" w:eastAsia="Times New Roman" w:hAnsi="Calibri" w:cs="Calibri"/>
-                <w:sz w:val="22"/>
-                <w:szCs w:val="22"/>
+                <w:rFonts w:eastAsia="Times New Roman"/>
               </w:rPr>
             </w:pPr>
             <w:r>
@@ -2912,34 +2338,18 @@
         <w:tc>
           <w:tcPr>
             <w:tcW w:w="0" w:type="auto"/>
-            <w:tcBorders>
-              <w:top w:val="single" w:sz="6" w:space="0" w:color="999999"/>
-              <w:left w:val="single" w:sz="6" w:space="0" w:color="999999"/>
-              <w:bottom w:val="single" w:sz="6" w:space="0" w:color="999999"/>
-              <w:right w:val="single" w:sz="6" w:space="0" w:color="999999"/>
-            </w:tcBorders>
-            <w:tcMar>
-              <w:top w:w="60" w:type="dxa"/>
-              <w:left w:w="120" w:type="dxa"/>
-              <w:bottom w:w="60" w:type="dxa"/>
-              <w:right w:w="120" w:type="dxa"/>
-            </w:tcMar>
             <w:vAlign w:val="center"/>
             <w:hideMark/>
           </w:tcPr>
           <w:p>
             <w:pPr>
               <w:rPr>
-                <w:rFonts w:ascii="Calibri" w:eastAsia="Times New Roman" w:hAnsi="Calibri" w:cs="Calibri"/>
-                <w:sz w:val="22"/>
-                <w:szCs w:val="22"/>
+                <w:rFonts w:eastAsia="Times New Roman"/>
               </w:rPr>
             </w:pPr>
             <w:r>
               <w:rPr>
-                <w:rFonts w:ascii="Calibri" w:eastAsia="Times New Roman" w:hAnsi="Calibri" w:cs="Calibri"/>
-                <w:sz w:val="22"/>
-                <w:szCs w:val="22"/>
+                <w:rFonts w:eastAsia="Times New Roman"/>
               </w:rPr>
               <w:t>—</w:t>
             </w:r>
@@ -2948,34 +2358,18 @@
         <w:tc>
           <w:tcPr>
             <w:tcW w:w="0" w:type="auto"/>
-            <w:tcBorders>
-              <w:top w:val="single" w:sz="6" w:space="0" w:color="999999"/>
-              <w:left w:val="single" w:sz="6" w:space="0" w:color="999999"/>
-              <w:bottom w:val="single" w:sz="6" w:space="0" w:color="999999"/>
-              <w:right w:val="single" w:sz="6" w:space="0" w:color="999999"/>
-            </w:tcBorders>
-            <w:tcMar>
-              <w:top w:w="60" w:type="dxa"/>
-              <w:left w:w="120" w:type="dxa"/>
-              <w:bottom w:w="60" w:type="dxa"/>
-              <w:right w:w="120" w:type="dxa"/>
-            </w:tcMar>
             <w:vAlign w:val="center"/>
             <w:hideMark/>
           </w:tcPr>
           <w:p>
             <w:pPr>
               <w:rPr>
-                <w:rFonts w:ascii="Calibri" w:eastAsia="Times New Roman" w:hAnsi="Calibri" w:cs="Calibri"/>
-                <w:sz w:val="22"/>
-                <w:szCs w:val="22"/>
+                <w:rFonts w:eastAsia="Times New Roman"/>
               </w:rPr>
             </w:pPr>
             <w:r>
               <w:rPr>
-                <w:rFonts w:ascii="Calibri" w:eastAsia="Times New Roman" w:hAnsi="Calibri" w:cs="Calibri"/>
-                <w:sz w:val="22"/>
-                <w:szCs w:val="22"/>
+                <w:rFonts w:eastAsia="Times New Roman"/>
               </w:rPr>
               <w:t xml:space="preserve">actualiza </w:t>
             </w:r>
@@ -2987,9 +2381,7 @@
             </w:r>
             <w:r>
               <w:rPr>
-                <w:rFonts w:ascii="Calibri" w:eastAsia="Times New Roman" w:hAnsi="Calibri" w:cs="Calibri"/>
-                <w:sz w:val="22"/>
-                <w:szCs w:val="22"/>
+                <w:rFonts w:eastAsia="Times New Roman"/>
               </w:rPr>
               <w:t xml:space="preserve"> con issue creado</w:t>
             </w:r>
@@ -2997,30 +2389,19 @@
         </w:tc>
       </w:tr>
       <w:tr>
+        <w:trPr>
+          <w:tblCellSpacing w:w="15" w:type="dxa"/>
+        </w:trPr>
         <w:tc>
           <w:tcPr>
             <w:tcW w:w="0" w:type="auto"/>
-            <w:tcBorders>
-              <w:top w:val="single" w:sz="6" w:space="0" w:color="999999"/>
-              <w:left w:val="single" w:sz="6" w:space="0" w:color="999999"/>
-              <w:bottom w:val="single" w:sz="6" w:space="0" w:color="999999"/>
-              <w:right w:val="single" w:sz="6" w:space="0" w:color="999999"/>
-            </w:tcBorders>
-            <w:tcMar>
-              <w:top w:w="60" w:type="dxa"/>
-              <w:left w:w="120" w:type="dxa"/>
-              <w:bottom w:w="60" w:type="dxa"/>
-              <w:right w:w="120" w:type="dxa"/>
-            </w:tcMar>
             <w:vAlign w:val="center"/>
             <w:hideMark/>
           </w:tcPr>
           <w:p>
             <w:pPr>
               <w:rPr>
-                <w:rFonts w:ascii="Calibri" w:eastAsia="Times New Roman" w:hAnsi="Calibri" w:cs="Calibri"/>
-                <w:sz w:val="22"/>
-                <w:szCs w:val="22"/>
+                <w:rFonts w:eastAsia="Times New Roman"/>
               </w:rPr>
             </w:pPr>
             <w:r>
@@ -3034,27 +2415,13 @@
         <w:tc>
           <w:tcPr>
             <w:tcW w:w="0" w:type="auto"/>
-            <w:tcBorders>
-              <w:top w:val="single" w:sz="6" w:space="0" w:color="999999"/>
-              <w:left w:val="single" w:sz="6" w:space="0" w:color="999999"/>
-              <w:bottom w:val="single" w:sz="6" w:space="0" w:color="999999"/>
-              <w:right w:val="single" w:sz="6" w:space="0" w:color="999999"/>
-            </w:tcBorders>
-            <w:tcMar>
-              <w:top w:w="60" w:type="dxa"/>
-              <w:left w:w="120" w:type="dxa"/>
-              <w:bottom w:w="60" w:type="dxa"/>
-              <w:right w:w="120" w:type="dxa"/>
-            </w:tcMar>
             <w:vAlign w:val="center"/>
             <w:hideMark/>
           </w:tcPr>
           <w:p>
             <w:pPr>
               <w:rPr>
-                <w:rFonts w:ascii="Calibri" w:eastAsia="Times New Roman" w:hAnsi="Calibri" w:cs="Calibri"/>
-                <w:sz w:val="22"/>
-                <w:szCs w:val="22"/>
+                <w:rFonts w:eastAsia="Times New Roman"/>
               </w:rPr>
             </w:pPr>
             <w:r>
@@ -3068,34 +2435,18 @@
         <w:tc>
           <w:tcPr>
             <w:tcW w:w="0" w:type="auto"/>
-            <w:tcBorders>
-              <w:top w:val="single" w:sz="6" w:space="0" w:color="999999"/>
-              <w:left w:val="single" w:sz="6" w:space="0" w:color="999999"/>
-              <w:bottom w:val="single" w:sz="6" w:space="0" w:color="999999"/>
-              <w:right w:val="single" w:sz="6" w:space="0" w:color="999999"/>
-            </w:tcBorders>
-            <w:tcMar>
-              <w:top w:w="60" w:type="dxa"/>
-              <w:left w:w="120" w:type="dxa"/>
-              <w:bottom w:w="60" w:type="dxa"/>
-              <w:right w:w="120" w:type="dxa"/>
-            </w:tcMar>
             <w:vAlign w:val="center"/>
             <w:hideMark/>
           </w:tcPr>
           <w:p>
             <w:pPr>
               <w:rPr>
-                <w:rFonts w:ascii="Calibri" w:eastAsia="Times New Roman" w:hAnsi="Calibri" w:cs="Calibri"/>
-                <w:sz w:val="22"/>
-                <w:szCs w:val="22"/>
+                <w:rFonts w:eastAsia="Times New Roman"/>
               </w:rPr>
             </w:pPr>
             <w:r>
               <w:rPr>
-                <w:rFonts w:ascii="Calibri" w:eastAsia="Times New Roman" w:hAnsi="Calibri" w:cs="Calibri"/>
-                <w:sz w:val="22"/>
-                <w:szCs w:val="22"/>
+                <w:rFonts w:eastAsia="Times New Roman"/>
               </w:rPr>
               <w:t>—</w:t>
             </w:r>
@@ -3103,30 +2454,19 @@
         </w:tc>
       </w:tr>
       <w:tr>
+        <w:trPr>
+          <w:tblCellSpacing w:w="15" w:type="dxa"/>
+        </w:trPr>
         <w:tc>
           <w:tcPr>
             <w:tcW w:w="0" w:type="auto"/>
-            <w:tcBorders>
-              <w:top w:val="single" w:sz="6" w:space="0" w:color="999999"/>
-              <w:left w:val="single" w:sz="6" w:space="0" w:color="999999"/>
-              <w:bottom w:val="single" w:sz="6" w:space="0" w:color="999999"/>
-              <w:right w:val="single" w:sz="6" w:space="0" w:color="999999"/>
-            </w:tcBorders>
-            <w:tcMar>
-              <w:top w:w="60" w:type="dxa"/>
-              <w:left w:w="120" w:type="dxa"/>
-              <w:bottom w:w="60" w:type="dxa"/>
-              <w:right w:w="120" w:type="dxa"/>
-            </w:tcMar>
             <w:vAlign w:val="center"/>
             <w:hideMark/>
           </w:tcPr>
           <w:p>
             <w:pPr>
               <w:rPr>
-                <w:rFonts w:ascii="Calibri" w:eastAsia="Times New Roman" w:hAnsi="Calibri" w:cs="Calibri"/>
-                <w:sz w:val="22"/>
-                <w:szCs w:val="22"/>
+                <w:rFonts w:eastAsia="Times New Roman"/>
               </w:rPr>
             </w:pPr>
             <w:r>
@@ -3140,27 +2480,13 @@
         <w:tc>
           <w:tcPr>
             <w:tcW w:w="0" w:type="auto"/>
-            <w:tcBorders>
-              <w:top w:val="single" w:sz="6" w:space="0" w:color="999999"/>
-              <w:left w:val="single" w:sz="6" w:space="0" w:color="999999"/>
-              <w:bottom w:val="single" w:sz="6" w:space="0" w:color="999999"/>
-              <w:right w:val="single" w:sz="6" w:space="0" w:color="999999"/>
-            </w:tcBorders>
-            <w:tcMar>
-              <w:top w:w="60" w:type="dxa"/>
-              <w:left w:w="120" w:type="dxa"/>
-              <w:bottom w:w="60" w:type="dxa"/>
-              <w:right w:w="120" w:type="dxa"/>
-            </w:tcMar>
             <w:vAlign w:val="center"/>
             <w:hideMark/>
           </w:tcPr>
           <w:p>
             <w:pPr>
               <w:rPr>
-                <w:rFonts w:ascii="Calibri" w:eastAsia="Times New Roman" w:hAnsi="Calibri" w:cs="Calibri"/>
-                <w:sz w:val="22"/>
-                <w:szCs w:val="22"/>
+                <w:rFonts w:eastAsia="Times New Roman"/>
               </w:rPr>
             </w:pPr>
             <w:r>
@@ -3174,27 +2500,13 @@
         <w:tc>
           <w:tcPr>
             <w:tcW w:w="0" w:type="auto"/>
-            <w:tcBorders>
-              <w:top w:val="single" w:sz="6" w:space="0" w:color="999999"/>
-              <w:left w:val="single" w:sz="6" w:space="0" w:color="999999"/>
-              <w:bottom w:val="single" w:sz="6" w:space="0" w:color="999999"/>
-              <w:right w:val="single" w:sz="6" w:space="0" w:color="999999"/>
-            </w:tcBorders>
-            <w:tcMar>
-              <w:top w:w="60" w:type="dxa"/>
-              <w:left w:w="120" w:type="dxa"/>
-              <w:bottom w:w="60" w:type="dxa"/>
-              <w:right w:w="120" w:type="dxa"/>
-            </w:tcMar>
             <w:vAlign w:val="center"/>
             <w:hideMark/>
           </w:tcPr>
           <w:p>
             <w:pPr>
               <w:rPr>
-                <w:rFonts w:ascii="Calibri" w:eastAsia="Times New Roman" w:hAnsi="Calibri" w:cs="Calibri"/>
-                <w:sz w:val="22"/>
-                <w:szCs w:val="22"/>
+                <w:rFonts w:eastAsia="Times New Roman"/>
               </w:rPr>
             </w:pPr>
             <w:r>
@@ -3205,9 +2517,7 @@
             </w:r>
             <w:r>
               <w:rPr>
-                <w:rFonts w:ascii="Calibri" w:eastAsia="Times New Roman" w:hAnsi="Calibri" w:cs="Calibri"/>
-                <w:sz w:val="22"/>
-                <w:szCs w:val="22"/>
+                <w:rFonts w:eastAsia="Times New Roman"/>
               </w:rPr>
               <w:t xml:space="preserve"> + actualiza </w:t>
             </w:r>
@@ -3221,30 +2531,19 @@
         </w:tc>
       </w:tr>
       <w:tr>
+        <w:trPr>
+          <w:tblCellSpacing w:w="15" w:type="dxa"/>
+        </w:trPr>
         <w:tc>
           <w:tcPr>
             <w:tcW w:w="0" w:type="auto"/>
-            <w:tcBorders>
-              <w:top w:val="single" w:sz="6" w:space="0" w:color="999999"/>
-              <w:left w:val="single" w:sz="6" w:space="0" w:color="999999"/>
-              <w:bottom w:val="single" w:sz="6" w:space="0" w:color="999999"/>
-              <w:right w:val="single" w:sz="6" w:space="0" w:color="999999"/>
-            </w:tcBorders>
-            <w:tcMar>
-              <w:top w:w="60" w:type="dxa"/>
-              <w:left w:w="120" w:type="dxa"/>
-              <w:bottom w:w="60" w:type="dxa"/>
-              <w:right w:w="120" w:type="dxa"/>
-            </w:tcMar>
             <w:vAlign w:val="center"/>
             <w:hideMark/>
           </w:tcPr>
           <w:p>
             <w:pPr>
               <w:rPr>
-                <w:rFonts w:ascii="Calibri" w:eastAsia="Times New Roman" w:hAnsi="Calibri" w:cs="Calibri"/>
-                <w:sz w:val="22"/>
-                <w:szCs w:val="22"/>
+                <w:rFonts w:eastAsia="Times New Roman"/>
               </w:rPr>
             </w:pPr>
             <w:r>
@@ -3258,27 +2557,13 @@
         <w:tc>
           <w:tcPr>
             <w:tcW w:w="0" w:type="auto"/>
-            <w:tcBorders>
-              <w:top w:val="single" w:sz="6" w:space="0" w:color="999999"/>
-              <w:left w:val="single" w:sz="6" w:space="0" w:color="999999"/>
-              <w:bottom w:val="single" w:sz="6" w:space="0" w:color="999999"/>
-              <w:right w:val="single" w:sz="6" w:space="0" w:color="999999"/>
-            </w:tcBorders>
-            <w:tcMar>
-              <w:top w:w="60" w:type="dxa"/>
-              <w:left w:w="120" w:type="dxa"/>
-              <w:bottom w:w="60" w:type="dxa"/>
-              <w:right w:w="120" w:type="dxa"/>
-            </w:tcMar>
             <w:vAlign w:val="center"/>
             <w:hideMark/>
           </w:tcPr>
           <w:p>
             <w:pPr>
               <w:rPr>
-                <w:rFonts w:ascii="Calibri" w:eastAsia="Times New Roman" w:hAnsi="Calibri" w:cs="Calibri"/>
-                <w:sz w:val="22"/>
-                <w:szCs w:val="22"/>
+                <w:rFonts w:eastAsia="Times New Roman"/>
               </w:rPr>
             </w:pPr>
             <w:r>
@@ -3292,34 +2577,18 @@
         <w:tc>
           <w:tcPr>
             <w:tcW w:w="0" w:type="auto"/>
-            <w:tcBorders>
-              <w:top w:val="single" w:sz="6" w:space="0" w:color="999999"/>
-              <w:left w:val="single" w:sz="6" w:space="0" w:color="999999"/>
-              <w:bottom w:val="single" w:sz="6" w:space="0" w:color="999999"/>
-              <w:right w:val="single" w:sz="6" w:space="0" w:color="999999"/>
-            </w:tcBorders>
-            <w:tcMar>
-              <w:top w:w="60" w:type="dxa"/>
-              <w:left w:w="120" w:type="dxa"/>
-              <w:bottom w:w="60" w:type="dxa"/>
-              <w:right w:w="120" w:type="dxa"/>
-            </w:tcMar>
             <w:vAlign w:val="center"/>
             <w:hideMark/>
           </w:tcPr>
           <w:p>
             <w:pPr>
               <w:rPr>
-                <w:rFonts w:ascii="Calibri" w:eastAsia="Times New Roman" w:hAnsi="Calibri" w:cs="Calibri"/>
-                <w:sz w:val="22"/>
-                <w:szCs w:val="22"/>
+                <w:rFonts w:eastAsia="Times New Roman"/>
               </w:rPr>
             </w:pPr>
             <w:r>
               <w:rPr>
-                <w:rFonts w:ascii="Calibri" w:eastAsia="Times New Roman" w:hAnsi="Calibri" w:cs="Calibri"/>
-                <w:sz w:val="22"/>
-                <w:szCs w:val="22"/>
+                <w:rFonts w:eastAsia="Times New Roman"/>
               </w:rPr>
               <w:t xml:space="preserve">actualiza </w:t>
             </w:r>
@@ -3331,9 +2600,7 @@
             </w:r>
             <w:r>
               <w:rPr>
-                <w:rFonts w:ascii="Calibri" w:eastAsia="Times New Roman" w:hAnsi="Calibri" w:cs="Calibri"/>
-                <w:sz w:val="22"/>
-                <w:szCs w:val="22"/>
+                <w:rFonts w:eastAsia="Times New Roman"/>
               </w:rPr>
               <w:t xml:space="preserve"> con progreso</w:t>
             </w:r>
@@ -3341,30 +2608,19 @@
         </w:tc>
       </w:tr>
       <w:tr>
+        <w:trPr>
+          <w:tblCellSpacing w:w="15" w:type="dxa"/>
+        </w:trPr>
         <w:tc>
           <w:tcPr>
             <w:tcW w:w="0" w:type="auto"/>
-            <w:tcBorders>
-              <w:top w:val="single" w:sz="6" w:space="0" w:color="999999"/>
-              <w:left w:val="single" w:sz="6" w:space="0" w:color="999999"/>
-              <w:bottom w:val="single" w:sz="6" w:space="0" w:color="999999"/>
-              <w:right w:val="single" w:sz="6" w:space="0" w:color="999999"/>
-            </w:tcBorders>
-            <w:tcMar>
-              <w:top w:w="60" w:type="dxa"/>
-              <w:left w:w="120" w:type="dxa"/>
-              <w:bottom w:w="60" w:type="dxa"/>
-              <w:right w:w="120" w:type="dxa"/>
-            </w:tcMar>
             <w:vAlign w:val="center"/>
             <w:hideMark/>
           </w:tcPr>
           <w:p>
             <w:pPr>
               <w:rPr>
-                <w:rFonts w:ascii="Calibri" w:eastAsia="Times New Roman" w:hAnsi="Calibri" w:cs="Calibri"/>
-                <w:sz w:val="22"/>
-                <w:szCs w:val="22"/>
+                <w:rFonts w:eastAsia="Times New Roman"/>
               </w:rPr>
             </w:pPr>
             <w:r>
@@ -3378,27 +2634,13 @@
         <w:tc>
           <w:tcPr>
             <w:tcW w:w="0" w:type="auto"/>
-            <w:tcBorders>
-              <w:top w:val="single" w:sz="6" w:space="0" w:color="999999"/>
-              <w:left w:val="single" w:sz="6" w:space="0" w:color="999999"/>
-              <w:bottom w:val="single" w:sz="6" w:space="0" w:color="999999"/>
-              <w:right w:val="single" w:sz="6" w:space="0" w:color="999999"/>
-            </w:tcBorders>
-            <w:tcMar>
-              <w:top w:w="60" w:type="dxa"/>
-              <w:left w:w="120" w:type="dxa"/>
-              <w:bottom w:w="60" w:type="dxa"/>
-              <w:right w:w="120" w:type="dxa"/>
-            </w:tcMar>
             <w:vAlign w:val="center"/>
             <w:hideMark/>
           </w:tcPr>
           <w:p>
             <w:pPr>
               <w:rPr>
-                <w:rFonts w:ascii="Calibri" w:eastAsia="Times New Roman" w:hAnsi="Calibri" w:cs="Calibri"/>
-                <w:sz w:val="22"/>
-                <w:szCs w:val="22"/>
+                <w:rFonts w:eastAsia="Times New Roman"/>
               </w:rPr>
             </w:pPr>
             <w:r>
@@ -3412,34 +2654,18 @@
         <w:tc>
           <w:tcPr>
             <w:tcW w:w="0" w:type="auto"/>
-            <w:tcBorders>
-              <w:top w:val="single" w:sz="6" w:space="0" w:color="999999"/>
-              <w:left w:val="single" w:sz="6" w:space="0" w:color="999999"/>
-              <w:bottom w:val="single" w:sz="6" w:space="0" w:color="999999"/>
-              <w:right w:val="single" w:sz="6" w:space="0" w:color="999999"/>
-            </w:tcBorders>
-            <w:tcMar>
-              <w:top w:w="60" w:type="dxa"/>
-              <w:left w:w="120" w:type="dxa"/>
-              <w:bottom w:w="60" w:type="dxa"/>
-              <w:right w:w="120" w:type="dxa"/>
-            </w:tcMar>
             <w:vAlign w:val="center"/>
             <w:hideMark/>
           </w:tcPr>
           <w:p>
             <w:pPr>
               <w:rPr>
-                <w:rFonts w:ascii="Calibri" w:eastAsia="Times New Roman" w:hAnsi="Calibri" w:cs="Calibri"/>
-                <w:sz w:val="22"/>
-                <w:szCs w:val="22"/>
+                <w:rFonts w:eastAsia="Times New Roman"/>
               </w:rPr>
             </w:pPr>
             <w:r>
               <w:rPr>
-                <w:rFonts w:ascii="Calibri" w:eastAsia="Times New Roman" w:hAnsi="Calibri" w:cs="Calibri"/>
-                <w:sz w:val="22"/>
-                <w:szCs w:val="22"/>
+                <w:rFonts w:eastAsia="Times New Roman"/>
               </w:rPr>
               <w:t xml:space="preserve">actualiza </w:t>
             </w:r>
@@ -3451,9 +2677,7 @@
             </w:r>
             <w:r>
               <w:rPr>
-                <w:rFonts w:ascii="Calibri" w:eastAsia="Times New Roman" w:hAnsi="Calibri" w:cs="Calibri"/>
-                <w:sz w:val="22"/>
-                <w:szCs w:val="22"/>
+                <w:rFonts w:eastAsia="Times New Roman"/>
               </w:rPr>
               <w:t xml:space="preserve"> con PR abierta</w:t>
             </w:r>
@@ -3461,30 +2685,19 @@
         </w:tc>
       </w:tr>
       <w:tr>
+        <w:trPr>
+          <w:tblCellSpacing w:w="15" w:type="dxa"/>
+        </w:trPr>
         <w:tc>
           <w:tcPr>
             <w:tcW w:w="0" w:type="auto"/>
-            <w:tcBorders>
-              <w:top w:val="single" w:sz="6" w:space="0" w:color="999999"/>
-              <w:left w:val="single" w:sz="6" w:space="0" w:color="999999"/>
-              <w:bottom w:val="single" w:sz="6" w:space="0" w:color="999999"/>
-              <w:right w:val="single" w:sz="6" w:space="0" w:color="999999"/>
-            </w:tcBorders>
-            <w:tcMar>
-              <w:top w:w="60" w:type="dxa"/>
-              <w:left w:w="120" w:type="dxa"/>
-              <w:bottom w:w="60" w:type="dxa"/>
-              <w:right w:w="120" w:type="dxa"/>
-            </w:tcMar>
             <w:vAlign w:val="center"/>
             <w:hideMark/>
           </w:tcPr>
           <w:p>
             <w:pPr>
               <w:rPr>
-                <w:rFonts w:ascii="Calibri" w:eastAsia="Times New Roman" w:hAnsi="Calibri" w:cs="Calibri"/>
-                <w:sz w:val="22"/>
-                <w:szCs w:val="22"/>
+                <w:rFonts w:eastAsia="Times New Roman"/>
               </w:rPr>
             </w:pPr>
             <w:r>
@@ -3498,34 +2711,18 @@
         <w:tc>
           <w:tcPr>
             <w:tcW w:w="0" w:type="auto"/>
-            <w:tcBorders>
-              <w:top w:val="single" w:sz="6" w:space="0" w:color="999999"/>
-              <w:left w:val="single" w:sz="6" w:space="0" w:color="999999"/>
-              <w:bottom w:val="single" w:sz="6" w:space="0" w:color="999999"/>
-              <w:right w:val="single" w:sz="6" w:space="0" w:color="999999"/>
-            </w:tcBorders>
-            <w:tcMar>
-              <w:top w:w="60" w:type="dxa"/>
-              <w:left w:w="120" w:type="dxa"/>
-              <w:bottom w:w="60" w:type="dxa"/>
-              <w:right w:w="120" w:type="dxa"/>
-            </w:tcMar>
             <w:vAlign w:val="center"/>
             <w:hideMark/>
           </w:tcPr>
           <w:p>
             <w:pPr>
               <w:rPr>
-                <w:rFonts w:ascii="Calibri" w:eastAsia="Times New Roman" w:hAnsi="Calibri" w:cs="Calibri"/>
-                <w:sz w:val="22"/>
-                <w:szCs w:val="22"/>
+                <w:rFonts w:eastAsia="Times New Roman"/>
               </w:rPr>
             </w:pPr>
             <w:r>
               <w:rPr>
-                <w:rFonts w:ascii="Calibri" w:eastAsia="Times New Roman" w:hAnsi="Calibri" w:cs="Calibri"/>
-                <w:sz w:val="22"/>
-                <w:szCs w:val="22"/>
+                <w:rFonts w:eastAsia="Times New Roman"/>
               </w:rPr>
               <w:t>—</w:t>
             </w:r>
@@ -3534,34 +2731,18 @@
         <w:tc>
           <w:tcPr>
             <w:tcW w:w="0" w:type="auto"/>
-            <w:tcBorders>
-              <w:top w:val="single" w:sz="6" w:space="0" w:color="999999"/>
-              <w:left w:val="single" w:sz="6" w:space="0" w:color="999999"/>
-              <w:bottom w:val="single" w:sz="6" w:space="0" w:color="999999"/>
-              <w:right w:val="single" w:sz="6" w:space="0" w:color="999999"/>
-            </w:tcBorders>
-            <w:tcMar>
-              <w:top w:w="60" w:type="dxa"/>
-              <w:left w:w="120" w:type="dxa"/>
-              <w:bottom w:w="60" w:type="dxa"/>
-              <w:right w:w="120" w:type="dxa"/>
-            </w:tcMar>
             <w:vAlign w:val="center"/>
             <w:hideMark/>
           </w:tcPr>
           <w:p>
             <w:pPr>
               <w:rPr>
-                <w:rFonts w:ascii="Calibri" w:eastAsia="Times New Roman" w:hAnsi="Calibri" w:cs="Calibri"/>
-                <w:sz w:val="22"/>
-                <w:szCs w:val="22"/>
+                <w:rFonts w:eastAsia="Times New Roman"/>
               </w:rPr>
             </w:pPr>
             <w:r>
               <w:rPr>
-                <w:rFonts w:ascii="Calibri" w:eastAsia="Times New Roman" w:hAnsi="Calibri" w:cs="Calibri"/>
-                <w:sz w:val="22"/>
-                <w:szCs w:val="22"/>
+                <w:rFonts w:eastAsia="Times New Roman"/>
               </w:rPr>
               <w:t xml:space="preserve">actualiza </w:t>
             </w:r>
@@ -3573,9 +2754,7 @@
             </w:r>
             <w:r>
               <w:rPr>
-                <w:rFonts w:ascii="Calibri" w:eastAsia="Times New Roman" w:hAnsi="Calibri" w:cs="Calibri"/>
-                <w:sz w:val="22"/>
-                <w:szCs w:val="22"/>
+                <w:rFonts w:eastAsia="Times New Roman"/>
               </w:rPr>
               <w:t xml:space="preserve"> con resultado</w:t>
             </w:r>
@@ -3583,30 +2762,19 @@
         </w:tc>
       </w:tr>
       <w:tr>
+        <w:trPr>
+          <w:tblCellSpacing w:w="15" w:type="dxa"/>
+        </w:trPr>
         <w:tc>
           <w:tcPr>
             <w:tcW w:w="0" w:type="auto"/>
-            <w:tcBorders>
-              <w:top w:val="single" w:sz="6" w:space="0" w:color="999999"/>
-              <w:left w:val="single" w:sz="6" w:space="0" w:color="999999"/>
-              <w:bottom w:val="single" w:sz="6" w:space="0" w:color="999999"/>
-              <w:right w:val="single" w:sz="6" w:space="0" w:color="999999"/>
-            </w:tcBorders>
-            <w:tcMar>
-              <w:top w:w="60" w:type="dxa"/>
-              <w:left w:w="120" w:type="dxa"/>
-              <w:bottom w:w="60" w:type="dxa"/>
-              <w:right w:w="120" w:type="dxa"/>
-            </w:tcMar>
             <w:vAlign w:val="center"/>
             <w:hideMark/>
           </w:tcPr>
           <w:p>
             <w:pPr>
               <w:rPr>
-                <w:rFonts w:ascii="Calibri" w:eastAsia="Times New Roman" w:hAnsi="Calibri" w:cs="Calibri"/>
-                <w:sz w:val="22"/>
-                <w:szCs w:val="22"/>
+                <w:rFonts w:eastAsia="Times New Roman"/>
               </w:rPr>
             </w:pPr>
             <w:r>
@@ -3620,34 +2788,18 @@
         <w:tc>
           <w:tcPr>
             <w:tcW w:w="0" w:type="auto"/>
-            <w:tcBorders>
-              <w:top w:val="single" w:sz="6" w:space="0" w:color="999999"/>
-              <w:left w:val="single" w:sz="6" w:space="0" w:color="999999"/>
-              <w:bottom w:val="single" w:sz="6" w:space="0" w:color="999999"/>
-              <w:right w:val="single" w:sz="6" w:space="0" w:color="999999"/>
-            </w:tcBorders>
-            <w:tcMar>
-              <w:top w:w="60" w:type="dxa"/>
-              <w:left w:w="120" w:type="dxa"/>
-              <w:bottom w:w="60" w:type="dxa"/>
-              <w:right w:w="120" w:type="dxa"/>
-            </w:tcMar>
             <w:vAlign w:val="center"/>
             <w:hideMark/>
           </w:tcPr>
           <w:p>
             <w:pPr>
               <w:rPr>
-                <w:rFonts w:ascii="Calibri" w:eastAsia="Times New Roman" w:hAnsi="Calibri" w:cs="Calibri"/>
-                <w:sz w:val="22"/>
-                <w:szCs w:val="22"/>
+                <w:rFonts w:eastAsia="Times New Roman"/>
               </w:rPr>
             </w:pPr>
             <w:r>
               <w:rPr>
-                <w:rFonts w:ascii="Calibri" w:eastAsia="Times New Roman" w:hAnsi="Calibri" w:cs="Calibri"/>
-                <w:sz w:val="22"/>
-                <w:szCs w:val="22"/>
+                <w:rFonts w:eastAsia="Times New Roman"/>
               </w:rPr>
               <w:t>—</w:t>
             </w:r>
@@ -3656,27 +2808,13 @@
         <w:tc>
           <w:tcPr>
             <w:tcW w:w="0" w:type="auto"/>
-            <w:tcBorders>
-              <w:top w:val="single" w:sz="6" w:space="0" w:color="999999"/>
-              <w:left w:val="single" w:sz="6" w:space="0" w:color="999999"/>
-              <w:bottom w:val="single" w:sz="6" w:space="0" w:color="999999"/>
-              <w:right w:val="single" w:sz="6" w:space="0" w:color="999999"/>
-            </w:tcBorders>
-            <w:tcMar>
-              <w:top w:w="60" w:type="dxa"/>
-              <w:left w:w="120" w:type="dxa"/>
-              <w:bottom w:w="60" w:type="dxa"/>
-              <w:right w:w="120" w:type="dxa"/>
-            </w:tcMar>
             <w:vAlign w:val="center"/>
             <w:hideMark/>
           </w:tcPr>
           <w:p>
             <w:pPr>
               <w:rPr>
-                <w:rFonts w:ascii="Calibri" w:eastAsia="Times New Roman" w:hAnsi="Calibri" w:cs="Calibri"/>
-                <w:sz w:val="22"/>
-                <w:szCs w:val="22"/>
+                <w:rFonts w:eastAsia="Times New Roman"/>
               </w:rPr>
             </w:pPr>
             <w:r>
@@ -3687,9 +2825,7 @@
             </w:r>
             <w:r>
               <w:rPr>
-                <w:rFonts w:ascii="Calibri" w:eastAsia="Times New Roman" w:hAnsi="Calibri" w:cs="Calibri"/>
-                <w:sz w:val="22"/>
-                <w:szCs w:val="22"/>
+                <w:rFonts w:eastAsia="Times New Roman"/>
               </w:rPr>
               <w:t xml:space="preserve"> + actualiza </w:t>
             </w:r>
@@ -3707,12 +2843,12 @@
       <w:pPr>
         <w:pStyle w:val="Ttulo3"/>
         <w:rPr>
-          <w:rFonts w:ascii="Calibri" w:eastAsia="Times New Roman" w:hAnsi="Calibri" w:cs="Calibri"/>
-        </w:rPr>
-      </w:pPr>
-      <w:r>
-        <w:rPr>
-          <w:rFonts w:ascii="Calibri" w:eastAsia="Times New Roman" w:hAnsi="Calibri" w:cs="Calibri"/>
+          <w:rFonts w:eastAsia="Times New Roman"/>
+        </w:rPr>
+      </w:pPr>
+      <w:r>
+        <w:rPr>
+          <w:rFonts w:eastAsia="Times New Roman"/>
         </w:rPr>
         <w:t>Vault compartido via GitHub</w:t>
       </w:r>
@@ -3720,18 +2856,8 @@
     <w:p>
       <w:pPr>
         <w:pStyle w:val="NormalWeb"/>
-        <w:rPr>
-          <w:rFonts w:ascii="Calibri" w:hAnsi="Calibri" w:cs="Calibri"/>
-          <w:sz w:val="22"/>
-          <w:szCs w:val="22"/>
-        </w:rPr>
-      </w:pPr>
-      <w:r>
-        <w:rPr>
-          <w:rFonts w:ascii="Calibri" w:hAnsi="Calibri" w:cs="Calibri"/>
-          <w:sz w:val="22"/>
-          <w:szCs w:val="22"/>
-        </w:rPr>
+      </w:pPr>
+      <w:r>
         <w:t>El vault es un repo git privado (</w:t>
       </w:r>
       <w:r>
@@ -3741,11 +2867,6 @@
         <w:t>sdd-vault</w:t>
       </w:r>
       <w:r>
-        <w:rPr>
-          <w:rFonts w:ascii="Calibri" w:hAnsi="Calibri" w:cs="Calibri"/>
-          <w:sz w:val="22"/>
-          <w:szCs w:val="22"/>
-        </w:rPr>
         <w:t>) — la memoria del workflow viaja entre máquinas y programadores:</w:t>
       </w:r>
     </w:p>
@@ -3757,16 +2878,12 @@
         </w:numPr>
         <w:spacing w:before="100" w:beforeAutospacing="1" w:after="100" w:afterAutospacing="1"/>
         <w:rPr>
-          <w:rFonts w:ascii="Calibri" w:eastAsia="Times New Roman" w:hAnsi="Calibri" w:cs="Calibri"/>
-          <w:sz w:val="22"/>
-          <w:szCs w:val="22"/>
-        </w:rPr>
-      </w:pPr>
-      <w:r>
-        <w:rPr>
-          <w:rFonts w:ascii="Calibri" w:eastAsia="Times New Roman" w:hAnsi="Calibri" w:cs="Calibri"/>
-          <w:sz w:val="22"/>
-          <w:szCs w:val="22"/>
+          <w:rFonts w:eastAsia="Times New Roman"/>
+        </w:rPr>
+      </w:pPr>
+      <w:r>
+        <w:rPr>
+          <w:rFonts w:eastAsia="Times New Roman"/>
         </w:rPr>
         <w:t xml:space="preserve">Claude hace </w:t>
       </w:r>
@@ -3778,9 +2895,7 @@
       </w:r>
       <w:r>
         <w:rPr>
-          <w:rFonts w:ascii="Calibri" w:eastAsia="Times New Roman" w:hAnsi="Calibri" w:cs="Calibri"/>
-          <w:sz w:val="22"/>
-          <w:szCs w:val="22"/>
+          <w:rFonts w:eastAsia="Times New Roman"/>
         </w:rPr>
         <w:t xml:space="preserve"> al iniciar sesión y commit+push tras cada operación que escribe en el vault.</w:t>
       </w:r>
@@ -3793,16 +2908,12 @@
         </w:numPr>
         <w:spacing w:before="100" w:beforeAutospacing="1" w:after="100" w:afterAutospacing="1"/>
         <w:rPr>
-          <w:rFonts w:ascii="Calibri" w:eastAsia="Times New Roman" w:hAnsi="Calibri" w:cs="Calibri"/>
-          <w:sz w:val="22"/>
-          <w:szCs w:val="22"/>
-        </w:rPr>
-      </w:pPr>
-      <w:r>
-        <w:rPr>
-          <w:rFonts w:ascii="Calibri" w:eastAsia="Times New Roman" w:hAnsi="Calibri" w:cs="Calibri"/>
-          <w:sz w:val="22"/>
-          <w:szCs w:val="22"/>
+          <w:rFonts w:eastAsia="Times New Roman"/>
+        </w:rPr>
+      </w:pPr>
+      <w:r>
+        <w:rPr>
+          <w:rFonts w:eastAsia="Times New Roman"/>
         </w:rPr>
         <w:t xml:space="preserve">Si dos personas trabajan el mismo proyecto en paralelo, coordinar: </w:t>
       </w:r>
@@ -3814,9 +2925,7 @@
       </w:r>
       <w:r>
         <w:rPr>
-          <w:rFonts w:ascii="Calibri" w:eastAsia="Times New Roman" w:hAnsi="Calibri" w:cs="Calibri"/>
-          <w:sz w:val="22"/>
-          <w:szCs w:val="22"/>
+          <w:rFonts w:eastAsia="Times New Roman"/>
         </w:rPr>
         <w:t xml:space="preserve"> se reescribe en cada operación.</w:t>
       </w:r>
@@ -3825,12 +2934,12 @@
       <w:pPr>
         <w:pStyle w:val="Ttulo3"/>
         <w:rPr>
-          <w:rFonts w:ascii="Calibri" w:eastAsia="Times New Roman" w:hAnsi="Calibri" w:cs="Calibri"/>
-        </w:rPr>
-      </w:pPr>
-      <w:r>
-        <w:rPr>
-          <w:rFonts w:ascii="Calibri" w:eastAsia="Times New Roman" w:hAnsi="Calibri" w:cs="Calibri"/>
+          <w:rFonts w:eastAsia="Times New Roman"/>
+        </w:rPr>
+      </w:pPr>
+      <w:r>
+        <w:rPr>
+          <w:rFonts w:eastAsia="Times New Roman"/>
         </w:rPr>
         <w:t>Portabilidad entre máquinas</w:t>
       </w:r>
@@ -3838,18 +2947,8 @@
     <w:p>
       <w:pPr>
         <w:pStyle w:val="NormalWeb"/>
-        <w:rPr>
-          <w:rFonts w:ascii="Calibri" w:hAnsi="Calibri" w:cs="Calibri"/>
-          <w:sz w:val="22"/>
-          <w:szCs w:val="22"/>
-        </w:rPr>
-      </w:pPr>
-      <w:r>
-        <w:rPr>
-          <w:rFonts w:ascii="Calibri" w:hAnsi="Calibri" w:cs="Calibri"/>
-          <w:sz w:val="22"/>
-          <w:szCs w:val="22"/>
-        </w:rPr>
+      </w:pPr>
+      <w:r>
         <w:t>En cada máquina nueva:</w:t>
       </w:r>
     </w:p>
@@ -3900,30 +2999,14 @@
         <w:rPr>
           <w:rStyle w:val="CdigoHTML"/>
         </w:rPr>
-        <w:t xml:space="preserve">$env:OBSIDIAN_VAULT = "C:\TPA"   </w:t>
-      </w:r>
-      <w:r>
-        <w:rPr>
-          <w:rStyle w:val="CdigoHTML"/>
-        </w:rPr>
-        <w:t># la misma ruta del clone</w:t>
+        <w:t>$env:OBSIDIAN_VAULT = "C:\TPA"   # la misma ruta del clone</w:t>
       </w:r>
     </w:p>
     <w:p>
       <w:pPr>
         <w:pStyle w:val="NormalWeb"/>
-        <w:rPr>
-          <w:rFonts w:ascii="Calibri" w:hAnsi="Calibri" w:cs="Calibri"/>
-          <w:sz w:val="22"/>
-          <w:szCs w:val="22"/>
-        </w:rPr>
-      </w:pPr>
-      <w:r>
-        <w:rPr>
-          <w:rFonts w:ascii="Calibri" w:hAnsi="Calibri" w:cs="Calibri"/>
-          <w:sz w:val="22"/>
-          <w:szCs w:val="22"/>
-        </w:rPr>
+      </w:pPr>
+      <w:r>
         <w:t>El repo no hardcodea rutas — funciona en cualquier equipo.</w:t>
       </w:r>
     </w:p>
@@ -3940,9 +3023,9 @@
 <file path=word/numbering.xml><?xml version="1.0" encoding="utf-8"?>
 <w:numbering xmlns:wpc="http://schemas.microsoft.com/office/word/2010/wordprocessingCanvas" xmlns:cx="http://schemas.microsoft.com/office/drawing/2014/chartex" xmlns:cx1="http://schemas.microsoft.com/office/drawing/2015/9/8/chartex" xmlns:cx2="http://schemas.microsoft.com/office/drawing/2015/10/21/chartex" xmlns:cx3="http://schemas.microsoft.com/office/drawing/2016/5/9/chartex" xmlns:cx4="http://schemas.microsoft.com/office/drawing/2016/5/10/chartex" xmlns:cx5="http://schemas.microsoft.com/office/drawing/2016/5/11/chartex" xmlns:cx6="http://schemas.microsoft.com/office/drawing/2016/5/12/chartex" xmlns:cx7="http://schemas.microsoft.com/office/drawing/2016/5/13/chartex" xmlns:cx8="http://schemas.microsoft.com/office/drawing/2016/5/14/chartex" xmlns:mc="http://schemas.openxmlformats.org/markup-compatibility/2006" xmlns:aink="http://schemas.microsoft.com/office/drawing/2016/ink" xmlns:am3d="http://schemas.microsoft.com/office/drawing/2017/model3d" xmlns:o="urn:schemas-microsoft-com:office:office" xmlns:oel="http://schemas.microsoft.com/office/2019/extlst" xmlns:r="http://schemas.openxmlformats.org/officeDocument/2006/relationships" xmlns:m="http://schemas.openxmlformats.org/officeDocument/2006/math" xmlns:v="urn:schemas-microsoft-com:vml" xmlns:wp14="http://schemas.microsoft.com/office/word/2010/wordprocessingDrawing" xmlns:wp="http://schemas.openxmlformats.org/drawingml/2006/wordprocessingDrawing" xmlns:w10="urn:schemas-microsoft-com:office:word" xmlns:w="http://schemas.openxmlformats.org/wordprocessingml/2006/main" xmlns:w14="http://schemas.microsoft.com/office/word/2010/wordml" xmlns:w15="http://schemas.microsoft.com/office/word/2012/wordml" xmlns:w16cex="http://schemas.microsoft.com/office/word/2018/wordml/cex" xmlns:w16cid="http://schemas.microsoft.com/office/word/2016/wordml/cid" xmlns:w16="http://schemas.microsoft.com/office/word/2018/wordml" xmlns:w16du="http://schemas.microsoft.com/office/word/2023/wordml/word16du" xmlns:w16sdtdh="http://schemas.microsoft.com/office/word/2020/wordml/sdtdatahash" xmlns:w16sdtfl="http://schemas.microsoft.com/office/word/2024/wordml/sdtformatlock" xmlns:w16se="http://schemas.microsoft.com/office/word/2015/wordml/symex" xmlns:wpg="http://schemas.microsoft.com/office/word/2010/wordprocessingGroup" xmlns:wpi="http://schemas.microsoft.com/office/word/2010/wordprocessingInk" xmlns:wne="http://schemas.microsoft.com/office/word/2006/wordml" xmlns:wps="http://schemas.microsoft.com/office/word/2010/wordprocessingShape" mc:Ignorable="w14 w15 w16se w16cid w16 w16cex w16sdtdh w16sdtfl w16du wp14">
   <w:abstractNum w:abstractNumId="0" w15:restartNumberingAfterBreak="0">
-    <w:nsid w:val="241036A1"/>
+    <w:nsid w:val="040F71A1"/>
     <w:multiLevelType w:val="multilevel"/>
-    <w:tmpl w:val="4FF4CF4E"/>
+    <w:tmpl w:val="D4FA3C7E"/>
     <w:lvl w:ilvl="0">
       <w:start w:val="1"/>
       <w:numFmt w:val="bullet"/>
@@ -4089,9 +3172,9 @@
     </w:lvl>
   </w:abstractNum>
   <w:abstractNum w:abstractNumId="1" w15:restartNumberingAfterBreak="0">
-    <w:nsid w:val="2E647D6D"/>
+    <w:nsid w:val="248412D6"/>
     <w:multiLevelType w:val="multilevel"/>
-    <w:tmpl w:val="02A4BA30"/>
+    <w:tmpl w:val="C1BA92D2"/>
     <w:lvl w:ilvl="0">
       <w:start w:val="1"/>
       <w:numFmt w:val="bullet"/>
@@ -4238,9 +3321,9 @@
     </w:lvl>
   </w:abstractNum>
   <w:abstractNum w:abstractNumId="2" w15:restartNumberingAfterBreak="0">
-    <w:nsid w:val="54C01DCE"/>
+    <w:nsid w:val="382E7BF1"/>
     <w:multiLevelType w:val="multilevel"/>
-    <w:tmpl w:val="6024B9E8"/>
+    <w:tmpl w:val="39DAC9B2"/>
     <w:lvl w:ilvl="0">
       <w:start w:val="1"/>
       <w:numFmt w:val="bullet"/>
@@ -4387,9 +3470,9 @@
     </w:lvl>
   </w:abstractNum>
   <w:abstractNum w:abstractNumId="3" w15:restartNumberingAfterBreak="0">
-    <w:nsid w:val="54EE678B"/>
+    <w:nsid w:val="438059BD"/>
     <w:multiLevelType w:val="multilevel"/>
-    <w:tmpl w:val="03341A32"/>
+    <w:tmpl w:val="FAC2AC7A"/>
     <w:lvl w:ilvl="0">
       <w:start w:val="1"/>
       <w:numFmt w:val="bullet"/>
@@ -4536,9 +3619,9 @@
     </w:lvl>
   </w:abstractNum>
   <w:abstractNum w:abstractNumId="4" w15:restartNumberingAfterBreak="0">
-    <w:nsid w:val="58C42F2A"/>
+    <w:nsid w:val="5A0D7C1F"/>
     <w:multiLevelType w:val="multilevel"/>
-    <w:tmpl w:val="2E3E8936"/>
+    <w:tmpl w:val="0DEA0F48"/>
     <w:lvl w:ilvl="0">
       <w:start w:val="1"/>
       <w:numFmt w:val="bullet"/>
@@ -4685,9 +3768,9 @@
     </w:lvl>
   </w:abstractNum>
   <w:abstractNum w:abstractNumId="5" w15:restartNumberingAfterBreak="0">
-    <w:nsid w:val="7E392D9C"/>
+    <w:nsid w:val="654006D0"/>
     <w:multiLevelType w:val="multilevel"/>
-    <w:tmpl w:val="CAC81010"/>
+    <w:tmpl w:val="19982F32"/>
     <w:lvl w:ilvl="0">
       <w:start w:val="1"/>
       <w:numFmt w:val="bullet"/>
@@ -4833,23 +3916,23 @@
       </w:rPr>
     </w:lvl>
   </w:abstractNum>
-  <w:num w:numId="1" w16cid:durableId="1051735620">
+  <w:num w:numId="1" w16cid:durableId="195511342">
     <w:abstractNumId w:val="0"/>
   </w:num>
-  <w:num w:numId="2" w16cid:durableId="1180045080">
+  <w:num w:numId="2" w16cid:durableId="1881476108">
     <w:abstractNumId w:val="5"/>
   </w:num>
-  <w:num w:numId="3" w16cid:durableId="543297708">
+  <w:num w:numId="3" w16cid:durableId="1066031807">
+    <w:abstractNumId w:val="4"/>
+  </w:num>
+  <w:num w:numId="4" w16cid:durableId="271517534">
     <w:abstractNumId w:val="1"/>
   </w:num>
-  <w:num w:numId="4" w16cid:durableId="843591688">
+  <w:num w:numId="5" w16cid:durableId="424347069">
     <w:abstractNumId w:val="3"/>
   </w:num>
-  <w:num w:numId="5" w16cid:durableId="873033274">
+  <w:num w:numId="6" w16cid:durableId="855191655">
     <w:abstractNumId w:val="2"/>
-  </w:num>
-  <w:num w:numId="6" w16cid:durableId="693576613">
-    <w:abstractNumId w:val="4"/>
   </w:num>
 </w:numbering>
 </file>
@@ -5266,8 +4349,8 @@
       <w:b/>
       <w:bCs/>
       <w:kern w:val="36"/>
-      <w:sz w:val="36"/>
-      <w:szCs w:val="36"/>
+      <w:sz w:val="48"/>
+      <w:szCs w:val="48"/>
     </w:rPr>
   </w:style>
   <w:style w:type="paragraph" w:styleId="Ttulo2">
@@ -5277,17 +4360,14 @@
     <w:uiPriority w:val="9"/>
     <w:qFormat/>
     <w:pPr>
-      <w:pBdr>
-        <w:bottom w:val="single" w:sz="6" w:space="0" w:color="999999"/>
-      </w:pBdr>
       <w:spacing w:before="100" w:beforeAutospacing="1" w:after="100" w:afterAutospacing="1"/>
       <w:outlineLvl w:val="1"/>
     </w:pPr>
     <w:rPr>
       <w:b/>
       <w:bCs/>
-      <w:sz w:val="28"/>
-      <w:szCs w:val="28"/>
+      <w:sz w:val="36"/>
+      <w:szCs w:val="36"/>
     </w:rPr>
   </w:style>
   <w:style w:type="paragraph" w:styleId="Ttulo3">
@@ -5303,6 +4383,8 @@
     <w:rPr>
       <w:b/>
       <w:bCs/>
+      <w:sz w:val="27"/>
+      <w:szCs w:val="27"/>
     </w:rPr>
   </w:style>
   <w:style w:type="character" w:default="1" w:styleId="Fuentedeprrafopredeter">
@@ -5332,18 +4414,12 @@
     <w:semiHidden/>
     <w:unhideWhenUsed/>
   </w:style>
-  <w:style w:type="character" w:styleId="CdigoHTML">
-    <w:name w:val="HTML Code"/>
-    <w:basedOn w:val="Fuentedeprrafopredeter"/>
-    <w:uiPriority w:val="99"/>
-    <w:semiHidden/>
-    <w:unhideWhenUsed/>
-    <w:rPr>
-      <w:rFonts w:ascii="Consolas" w:eastAsiaTheme="minorEastAsia" w:hAnsi="Consolas" w:cs="Courier New" w:hint="default"/>
-      <w:sz w:val="20"/>
-      <w:szCs w:val="20"/>
-      <w:shd w:val="clear" w:color="auto" w:fill="F4F4F4"/>
-    </w:rPr>
+  <w:style w:type="paragraph" w:customStyle="1" w:styleId="msonormal0">
+    <w:name w:val="msonormal"/>
+    <w:basedOn w:val="Normal"/>
+    <w:pPr>
+      <w:spacing w:before="100" w:beforeAutospacing="1" w:after="100" w:afterAutospacing="1"/>
+    </w:pPr>
   </w:style>
   <w:style w:type="character" w:customStyle="1" w:styleId="Ttulo1Car">
     <w:name w:val="Título 1 Car"/>
@@ -5370,6 +4446,16 @@
       <w:szCs w:val="32"/>
     </w:rPr>
   </w:style>
+  <w:style w:type="paragraph" w:styleId="NormalWeb">
+    <w:name w:val="Normal (Web)"/>
+    <w:basedOn w:val="Normal"/>
+    <w:uiPriority w:val="99"/>
+    <w:semiHidden/>
+    <w:unhideWhenUsed/>
+    <w:pPr>
+      <w:spacing w:before="100" w:beforeAutospacing="1" w:after="100" w:afterAutospacing="1"/>
+    </w:pPr>
+  </w:style>
   <w:style w:type="character" w:customStyle="1" w:styleId="Ttulo3Car">
     <w:name w:val="Título 3 Car"/>
     <w:basedOn w:val="Fuentedeprrafopredeter"/>
@@ -5391,13 +4477,6 @@
     <w:semiHidden/>
     <w:unhideWhenUsed/>
     <w:pPr>
-      <w:pBdr>
-        <w:top w:val="single" w:sz="6" w:space="6" w:color="DDDDDD"/>
-        <w:left w:val="single" w:sz="6" w:space="6" w:color="DDDDDD"/>
-        <w:bottom w:val="single" w:sz="6" w:space="6" w:color="DDDDDD"/>
-        <w:right w:val="single" w:sz="6" w:space="6" w:color="DDDDDD"/>
-      </w:pBdr>
-      <w:shd w:val="clear" w:color="auto" w:fill="F4F4F4"/>
       <w:tabs>
         <w:tab w:val="left" w:pos="916"/>
         <w:tab w:val="left" w:pos="1832"/>
@@ -5418,7 +4497,7 @@
       </w:tabs>
     </w:pPr>
     <w:rPr>
-      <w:rFonts w:ascii="Consolas" w:hAnsi="Consolas" w:cs="Courier New"/>
+      <w:rFonts w:ascii="Courier New" w:hAnsi="Courier New" w:cs="Courier New"/>
       <w:sz w:val="20"/>
       <w:szCs w:val="20"/>
     </w:rPr>
@@ -5433,22 +4512,17 @@
       <w:rFonts w:ascii="Consolas" w:eastAsiaTheme="minorEastAsia" w:hAnsi="Consolas"/>
     </w:rPr>
   </w:style>
-  <w:style w:type="paragraph" w:customStyle="1" w:styleId="msonormal0">
-    <w:name w:val="msonormal"/>
-    <w:basedOn w:val="Normal"/>
-    <w:pPr>
-      <w:spacing w:before="100" w:beforeAutospacing="1" w:after="100" w:afterAutospacing="1"/>
-    </w:pPr>
-  </w:style>
-  <w:style w:type="paragraph" w:styleId="NormalWeb">
-    <w:name w:val="Normal (Web)"/>
-    <w:basedOn w:val="Normal"/>
+  <w:style w:type="character" w:styleId="CdigoHTML">
+    <w:name w:val="HTML Code"/>
+    <w:basedOn w:val="Fuentedeprrafopredeter"/>
     <w:uiPriority w:val="99"/>
     <w:semiHidden/>
     <w:unhideWhenUsed/>
-    <w:pPr>
-      <w:spacing w:before="100" w:beforeAutospacing="1" w:after="100" w:afterAutospacing="1"/>
-    </w:pPr>
+    <w:rPr>
+      <w:rFonts w:ascii="Courier New" w:eastAsiaTheme="minorEastAsia" w:hAnsi="Courier New" w:cs="Courier New"/>
+      <w:sz w:val="20"/>
+      <w:szCs w:val="20"/>
+    </w:rPr>
   </w:style>
   <w:style w:type="character" w:styleId="Fuerte">
     <w:name w:val="Strong"/>

</xml_diff>